<commit_message>
Preserve formatting during scoped layout repair (#39)
</commit_message>
<xml_diff>
--- a/assets/client-templates/docx/ambispective-icf.template.docx
+++ b/assets/client-templates/docx/ambispective-icf.template.docx
@@ -4,6 +4,23 @@
   <w:body>
     <w:p>
       <w:pPr>
+        <w:keepNext/>
+        <w:spacing w:after="360" w:line="276" w:lineRule="auto"/>
+        <w:jc w:val="center"/>
+      </w:pPr>
+      <w:r>
+        <w:rPr>
+          <w:rFonts w:ascii="Verdana" w:hAnsi="Verdana" w:eastAsia="Verdana" w:cs="Verdana"/>
+          <w:b/>
+          <w:i/>
+          <w:sz w:val="22"/>
+        </w:rPr>
+        <w:t>NOT TO BE USED FOR PARTICIPANT ENROLLMENT</w:t>
+      </w:r>
+    </w:p>
+    <w:p>
+      <w:pPr>
+        <w:spacing w:line="276" w:lineRule="auto"/>
         <w:ind w:right="27"/>
         <w:jc w:val="center"/>
         <w:rPr>
@@ -14,9 +31,10 @@
       </w:pPr>
       <w:r>
         <w:rPr>
-          <w:rFonts w:ascii="Calibri" w:cs="Calibri" w:eastAsia="Calibri" w:hAnsi="Calibri"/>
+          <w:rFonts w:ascii="Verdana" w:cs="Verdana" w:eastAsia="Verdana" w:hAnsi="Verdana"/>
           <w:b w:val="1"/>
           <w:bCs w:val="1"/>
+          <w:sz w:val="22"/>
           <w:rtl w:val="0"/>
         </w:rPr>
         <w:t xml:space="preserve">AN AGREEMENT TO BE IN A RESEARCH STUDY </w:t>
@@ -24,6 +42,7 @@
     </w:p>
     <w:p>
       <w:pPr>
+        <w:spacing w:line="276" w:lineRule="auto"/>
         <w:ind w:right="27"/>
         <w:jc w:val="center"/>
         <w:rPr>
@@ -34,9 +53,10 @@
       </w:pPr>
       <w:r>
         <w:rPr>
-          <w:rFonts w:ascii="Calibri" w:cs="Calibri" w:eastAsia="Calibri" w:hAnsi="Calibri"/>
+          <w:rFonts w:ascii="Verdana" w:cs="Verdana" w:eastAsia="Verdana" w:hAnsi="Verdana"/>
           <w:b w:val="1"/>
           <w:bCs w:val="1"/>
+          <w:sz w:val="22"/>
           <w:rtl w:val="0"/>
         </w:rPr>
         <w:t xml:space="preserve">INFORMED CONSENT DOCUMENT</w:t>
@@ -54,6 +74,8 @@
       </w:pPr>
       <w:r>
         <w:rPr>
+          <w:rFonts w:ascii="Verdana" w:hAnsi="Verdana" w:eastAsia="Verdana" w:cs="Verdana"/>
+          <w:sz w:val="22"/>
           <w:rtl w:val="0"/>
         </w:rPr>
       </w:r>
@@ -81,6 +103,7 @@
           </w:tcPr>
           <w:p>
             <w:pPr>
+              <w:spacing w:line="276" w:lineRule="auto"/>
               <w:rPr>
                 <w:rFonts w:ascii="Calibri" w:cs="Calibri" w:eastAsia="Calibri" w:hAnsi="Calibri"/>
                 <w:b w:val="1"/>
@@ -89,9 +112,10 @@
             </w:pPr>
             <w:r>
               <w:rPr>
-                <w:rFonts w:ascii="Calibri" w:cs="Calibri" w:eastAsia="Calibri" w:hAnsi="Calibri"/>
+                <w:rFonts w:ascii="Verdana" w:cs="Verdana" w:eastAsia="Verdana" w:hAnsi="Verdana"/>
                 <w:b w:val="1"/>
                 <w:bCs w:val="1"/>
+                <w:sz w:val="22"/>
                 <w:rtl w:val="0"/>
               </w:rPr>
               <w:t xml:space="preserve">Sponsor / Study Title:</w:t>
@@ -107,9 +131,10 @@
             </w:pPr>
             <w:r>
               <w:rPr>
-                <w:rFonts w:ascii="Calibri" w:cs="Calibri" w:eastAsia="Calibri" w:hAnsi="Calibri"/>
+                <w:rFonts w:ascii="Verdana" w:cs="Verdana" w:eastAsia="Verdana" w:hAnsi="Verdana"/>
                 <w:b w:val="1"/>
                 <w:bCs w:val="1"/>
+                <w:sz w:val="22"/>
                 <w:rtl w:val="0"/>
               </w:rPr>
               <w:t xml:space="preserve"> </w:t>
@@ -122,6 +147,7 @@
           </w:tcPr>
           <w:p>
             <w:pPr>
+              <w:spacing w:line="276" w:lineRule="auto"/>
               <w:rPr>
                 <w:rFonts w:ascii="Calibri" w:cs="Calibri" w:eastAsia="Calibri" w:hAnsi="Calibri"/>
                 <w:b w:val="1"/>
@@ -130,9 +156,10 @@
             </w:pPr>
             <w:r>
               <w:rPr>
-                <w:rFonts w:ascii="Calibri" w:cs="Calibri" w:eastAsia="Calibri" w:hAnsi="Calibri"/>
+                <w:rFonts w:ascii="Verdana" w:cs="Verdana" w:eastAsia="Verdana" w:hAnsi="Verdana"/>
                 <w:b w:val="1"/>
                 <w:bCs w:val="1"/>
+                <w:sz w:val="22"/>
                 <w:rtl w:val="0"/>
               </w:rPr>
               <w:t xml:space="preserve">{sponsorName} / “{studyTitle}”</w:t>
@@ -148,6 +175,8 @@
             </w:pPr>
             <w:r>
               <w:rPr>
+                <w:rFonts w:ascii="Verdana" w:hAnsi="Verdana" w:eastAsia="Verdana" w:cs="Verdana"/>
+                <w:sz w:val="22"/>
                 <w:rtl w:val="0"/>
               </w:rPr>
             </w:r>
@@ -165,6 +194,7 @@
           </w:tcPr>
           <w:p>
             <w:pPr>
+              <w:spacing w:line="276" w:lineRule="auto"/>
               <w:rPr>
                 <w:rFonts w:ascii="Calibri" w:cs="Calibri" w:eastAsia="Calibri" w:hAnsi="Calibri"/>
                 <w:b w:val="1"/>
@@ -173,9 +203,10 @@
             </w:pPr>
             <w:r>
               <w:rPr>
-                <w:rFonts w:ascii="Calibri" w:cs="Calibri" w:eastAsia="Calibri" w:hAnsi="Calibri"/>
+                <w:rFonts w:ascii="Verdana" w:cs="Verdana" w:eastAsia="Verdana" w:hAnsi="Verdana"/>
                 <w:b w:val="1"/>
                 <w:bCs w:val="1"/>
+                <w:sz w:val="22"/>
                 <w:rtl w:val="0"/>
               </w:rPr>
               <w:t xml:space="preserve">Protocol Number:</w:t>
@@ -191,6 +222,8 @@
             </w:pPr>
             <w:r>
               <w:rPr>
+                <w:rFonts w:ascii="Verdana" w:hAnsi="Verdana" w:eastAsia="Verdana" w:cs="Verdana"/>
+                <w:sz w:val="22"/>
                 <w:rtl w:val="0"/>
               </w:rPr>
             </w:r>
@@ -202,6 +235,7 @@
           </w:tcPr>
           <w:p>
             <w:pPr>
+              <w:spacing w:line="276" w:lineRule="auto"/>
               <w:rPr>
                 <w:rFonts w:ascii="Calibri" w:cs="Calibri" w:eastAsia="Calibri" w:hAnsi="Calibri"/>
                 <w:b w:val="1"/>
@@ -210,9 +244,10 @@
             </w:pPr>
             <w:r>
               <w:rPr>
-                <w:rFonts w:ascii="Calibri" w:cs="Calibri" w:eastAsia="Calibri" w:hAnsi="Calibri"/>
+                <w:rFonts w:ascii="Verdana" w:cs="Verdana" w:eastAsia="Verdana" w:hAnsi="Verdana"/>
                 <w:b w:val="1"/>
                 <w:bCs w:val="1"/>
+                <w:sz w:val="22"/>
                 <w:rtl w:val="0"/>
               </w:rPr>
               <w:t xml:space="preserve">{protocolNumber}</w:t>
@@ -228,6 +263,8 @@
             </w:pPr>
             <w:r>
               <w:rPr>
+                <w:rFonts w:ascii="Verdana" w:hAnsi="Verdana" w:eastAsia="Verdana" w:cs="Verdana"/>
+                <w:sz w:val="22"/>
                 <w:rtl w:val="0"/>
               </w:rPr>
             </w:r>
@@ -245,6 +282,7 @@
           </w:tcPr>
           <w:p>
             <w:pPr>
+              <w:spacing w:line="276" w:lineRule="auto"/>
               <w:rPr>
                 <w:rFonts w:ascii="Calibri" w:cs="Calibri" w:eastAsia="Calibri" w:hAnsi="Calibri"/>
                 <w:b w:val="1"/>
@@ -253,9 +291,10 @@
             </w:pPr>
             <w:r>
               <w:rPr>
-                <w:rFonts w:ascii="Calibri" w:cs="Calibri" w:eastAsia="Calibri" w:hAnsi="Calibri"/>
+                <w:rFonts w:ascii="Verdana" w:cs="Verdana" w:eastAsia="Verdana" w:hAnsi="Verdana"/>
                 <w:b w:val="1"/>
                 <w:bCs w:val="1"/>
+                <w:sz w:val="22"/>
                 <w:rtl w:val="0"/>
               </w:rPr>
               <w:t xml:space="preserve">Principal Investigator:</w:t>
@@ -263,6 +302,7 @@
           </w:p>
           <w:p>
             <w:pPr>
+              <w:spacing w:line="276" w:lineRule="auto"/>
               <w:rPr>
                 <w:rFonts w:ascii="Calibri" w:cs="Calibri" w:eastAsia="Calibri" w:hAnsi="Calibri"/>
                 <w:b w:val="1"/>
@@ -271,9 +311,10 @@
             </w:pPr>
             <w:r>
               <w:rPr>
-                <w:rFonts w:ascii="Calibri" w:cs="Calibri" w:eastAsia="Calibri" w:hAnsi="Calibri"/>
+                <w:rFonts w:ascii="Verdana" w:cs="Verdana" w:eastAsia="Verdana" w:hAnsi="Verdana"/>
                 <w:b w:val="1"/>
                 <w:bCs w:val="1"/>
+                <w:sz w:val="22"/>
                 <w:rtl w:val="0"/>
               </w:rPr>
               <w:t xml:space="preserve">(Study Doctor)</w:t>
@@ -289,6 +330,8 @@
             </w:pPr>
             <w:r>
               <w:rPr>
+                <w:rFonts w:ascii="Verdana" w:hAnsi="Verdana" w:eastAsia="Verdana" w:cs="Verdana"/>
+                <w:sz w:val="22"/>
                 <w:rtl w:val="0"/>
               </w:rPr>
             </w:r>
@@ -300,6 +343,7 @@
           </w:tcPr>
           <w:p>
             <w:pPr>
+              <w:spacing w:line="276" w:lineRule="auto"/>
               <w:rPr>
                 <w:rFonts w:ascii="Calibri" w:cs="Calibri" w:eastAsia="Calibri" w:hAnsi="Calibri"/>
                 <w:b w:val="1"/>
@@ -308,9 +352,10 @@
             </w:pPr>
             <w:r>
               <w:rPr>
-                <w:rFonts w:ascii="Calibri" w:cs="Calibri" w:eastAsia="Calibri" w:hAnsi="Calibri"/>
+                <w:rFonts w:ascii="Verdana" w:cs="Verdana" w:eastAsia="Verdana" w:hAnsi="Verdana"/>
                 <w:b w:val="1"/>
                 <w:bCs w:val="1"/>
+                <w:sz w:val="22"/>
                 <w:rtl w:val="0"/>
               </w:rPr>
               <w:t xml:space="preserve">{principalInvestigatorName} </w:t>
@@ -329,6 +374,7 @@
           </w:tcPr>
           <w:p>
             <w:pPr>
+              <w:spacing w:line="276" w:lineRule="auto"/>
               <w:rPr>
                 <w:rFonts w:ascii="Calibri" w:cs="Calibri" w:eastAsia="Calibri" w:hAnsi="Calibri"/>
                 <w:b w:val="1"/>
@@ -337,9 +383,10 @@
             </w:pPr>
             <w:r>
               <w:rPr>
-                <w:rFonts w:ascii="Calibri" w:cs="Calibri" w:eastAsia="Calibri" w:hAnsi="Calibri"/>
+                <w:rFonts w:ascii="Verdana" w:cs="Verdana" w:eastAsia="Verdana" w:hAnsi="Verdana"/>
                 <w:b w:val="1"/>
                 <w:bCs w:val="1"/>
+                <w:sz w:val="22"/>
                 <w:rtl w:val="0"/>
               </w:rPr>
               <w:t xml:space="preserve">Telephone:</w:t>
@@ -355,6 +402,8 @@
             </w:pPr>
             <w:r>
               <w:rPr>
+                <w:rFonts w:ascii="Verdana" w:hAnsi="Verdana" w:eastAsia="Verdana" w:cs="Verdana"/>
+                <w:sz w:val="22"/>
                 <w:rtl w:val="0"/>
               </w:rPr>
             </w:r>
@@ -366,6 +415,7 @@
           </w:tcPr>
           <w:p>
             <w:pPr>
+              <w:spacing w:line="276" w:lineRule="auto"/>
               <w:rPr>
                 <w:rFonts w:ascii="Calibri" w:cs="Calibri" w:eastAsia="Calibri" w:hAnsi="Calibri"/>
                 <w:b w:val="1"/>
@@ -374,9 +424,10 @@
             </w:pPr>
             <w:r>
               <w:rPr>
-                <w:rFonts w:ascii="Calibri" w:cs="Calibri" w:eastAsia="Calibri" w:hAnsi="Calibri"/>
+                <w:rFonts w:ascii="Verdana" w:cs="Verdana" w:eastAsia="Verdana" w:hAnsi="Verdana"/>
                 <w:b w:val="1"/>
                 <w:bCs w:val="1"/>
+                <w:sz w:val="22"/>
                 <w:rtl w:val="0"/>
               </w:rPr>
               <w:t xml:space="preserve">{studyCordinatorPhone}</w:t>
@@ -396,6 +447,7 @@
           </w:tcPr>
           <w:p>
             <w:pPr>
+              <w:spacing w:line="276" w:lineRule="auto"/>
               <w:rPr>
                 <w:rFonts w:ascii="Calibri" w:cs="Calibri" w:eastAsia="Calibri" w:hAnsi="Calibri"/>
                 <w:b w:val="1"/>
@@ -404,9 +456,10 @@
             </w:pPr>
             <w:r>
               <w:rPr>
-                <w:rFonts w:ascii="Calibri" w:cs="Calibri" w:eastAsia="Calibri" w:hAnsi="Calibri"/>
+                <w:rFonts w:ascii="Verdana" w:cs="Verdana" w:eastAsia="Verdana" w:hAnsi="Verdana"/>
                 <w:b w:val="1"/>
                 <w:bCs w:val="1"/>
+                <w:sz w:val="22"/>
                 <w:rtl w:val="0"/>
               </w:rPr>
               <w:t xml:space="preserve">Address:</w:t>
@@ -419,6 +472,7 @@
           </w:tcPr>
           <w:p>
             <w:pPr>
+              <w:spacing w:line="276" w:lineRule="auto"/>
               <w:rPr>
                 <w:rFonts w:ascii="Calibri" w:cs="Calibri" w:eastAsia="Calibri" w:hAnsi="Calibri"/>
                 <w:b w:val="1"/>
@@ -427,9 +481,10 @@
             </w:pPr>
             <w:r>
               <w:rPr>
-                <w:rFonts w:ascii="Calibri" w:cs="Calibri" w:eastAsia="Calibri" w:hAnsi="Calibri"/>
+                <w:rFonts w:ascii="Verdana" w:cs="Verdana" w:eastAsia="Verdana" w:hAnsi="Verdana"/>
                 <w:b w:val="1"/>
                 <w:bCs w:val="1"/>
+                <w:sz w:val="22"/>
                 <w:rtl w:val="0"/>
               </w:rPr>
               <w:t xml:space="preserve">{sponsorAdress}</w:t>
@@ -446,6 +501,8 @@
       </w:pPr>
       <w:r>
         <w:rPr>
+          <w:rFonts w:ascii="Verdana" w:hAnsi="Verdana" w:eastAsia="Verdana" w:cs="Verdana"/>
+          <w:sz w:val="22"/>
           <w:rtl w:val="0"/>
         </w:rPr>
       </w:r>
@@ -453,49 +510,120 @@
     <w:p>
       <w:pPr>
         <w:keepNext w:val="1"/>
+        <w:spacing w:line="276" w:lineRule="auto"/>
         <w:ind w:right="27"/>
         <w:rPr>
           <w:rFonts w:ascii="Calibri" w:cs="Calibri" w:eastAsia="Calibri" w:hAnsi="Calibri"/>
         </w:rPr>
       </w:pPr>
       <w:r>
+        <w:rPr>
+          <w:rFonts w:ascii="Verdana" w:cs="Verdana" w:eastAsia="Verdana" w:hAnsi="Verdana"/>
+          <w:b w:val="1"/>
+          <w:bCs w:val="1"/>
+          <w:sz w:val="22"/>
+          <w:u w:val="single"/>
+          <w:rtl w:val="0"/>
+        </w:rPr>
+        <w:t xml:space="preserve">INTRODUCTION</w:t>
+      </w:r>
+      <w:r>
+        <w:rPr>
+          <w:rFonts w:ascii="Verdana" w:hAnsi="Verdana" w:eastAsia="Verdana" w:cs="Verdana"/>
+          <w:sz w:val="22"/>
+          <w:rtl w:val="0"/>
+        </w:rPr>
+      </w:r>
+    </w:p>
+    <w:p>
+      <w:pPr>
+        <w:spacing w:line="276" w:lineRule="auto"/>
+        <w:rPr>
+          <w:rFonts w:ascii="Calibri" w:cs="Calibri" w:eastAsia="Calibri" w:hAnsi="Calibri"/>
+        </w:rPr>
+      </w:pPr>
+      <w:r>
+        <w:rPr>
+          <w:rFonts w:ascii="Verdana" w:cs="Verdana" w:eastAsia="Verdana" w:hAnsi="Verdana"/>
+          <w:sz w:val="22"/>
+          <w:rtl w:val="0"/>
+        </w:rPr>
+        <w:t xml:space="preserve">You are being invited to take part in a medical research study. Before you decide to take part in this study, you should read this document. This document, called an informed consent document, explains the study. Please ask as many questions as needed so that you can decide if you want to participate in the study. This document may contain words that you do not understand. Please have the Study Doctor or study staff explain any words that you do not fully understand. Once you understand the study, and if you want to participate, you will be asked to sign and date this document and a copy will be given to you.</w:t>
+      </w:r>
+    </w:p>
+    <w:p>
+      <w:pPr>
+        <w:rPr>
+          <w:rFonts w:ascii="Calibri" w:cs="Calibri" w:eastAsia="Calibri" w:hAnsi="Calibri"/>
+        </w:rPr>
+      </w:pPr>
+      <w:r>
+        <w:rPr>
+          <w:rFonts w:ascii="Verdana" w:hAnsi="Verdana" w:eastAsia="Verdana" w:cs="Verdana"/>
+          <w:sz w:val="22"/>
+          <w:rtl w:val="0"/>
+        </w:rPr>
+      </w:r>
+    </w:p>
+    <w:p>
+      <w:pPr>
+        <w:keepNext w:val="1"/>
+        <w:spacing w:line="276" w:lineRule="auto"/>
+        <w:ind w:right="6427"/>
+        <w:rPr>
+          <w:rFonts w:ascii="Calibri" w:cs="Calibri" w:eastAsia="Calibri" w:hAnsi="Calibri"/>
+        </w:rPr>
+      </w:pPr>
+      <w:r>
+        <w:rPr>
+          <w:rFonts w:ascii="Verdana" w:cs="Verdana" w:eastAsia="Verdana" w:hAnsi="Verdana"/>
+          <w:b w:val="1"/>
+          <w:bCs w:val="1"/>
+          <w:sz w:val="22"/>
+          <w:u w:val="single"/>
+          <w:rtl w:val="0"/>
+        </w:rPr>
+        <w:t xml:space="preserve">PURPOSE OF THE STUDY</w:t>
+      </w:r>
+      <w:r>
+        <w:rPr>
+          <w:rFonts w:ascii="Verdana" w:hAnsi="Verdana" w:eastAsia="Verdana" w:cs="Verdana"/>
+          <w:sz w:val="22"/>
+          <w:rtl w:val="0"/>
+        </w:rPr>
+      </w:r>
+    </w:p>
+    <w:p>
+      <w:pPr>
+        <w:spacing w:line="276" w:lineRule="auto"/>
+        <w:ind w:right="57"/>
+        <w:rPr>
+          <w:rFonts w:ascii="Calibri" w:cs="Calibri" w:eastAsia="Calibri" w:hAnsi="Calibri"/>
+        </w:rPr>
+      </w:pPr>
+      <w:r>
+        <w:rPr>
+          <w:rFonts w:ascii="Verdana" w:cs="Verdana" w:eastAsia="Verdana" w:hAnsi="Verdana"/>
+          <w:sz w:val="22"/>
+          <w:rtl w:val="0"/>
+        </w:rPr>
+        <w:t xml:space="preserve">{AI_studyPurpose}</w:t>
+      </w:r>
+    </w:p>
+    <w:p>
+      <w:pPr>
+        <w:ind w:right="57"/>
         <w:rPr>
           <w:rFonts w:ascii="Calibri" w:cs="Calibri" w:eastAsia="Calibri" w:hAnsi="Calibri"/>
           <w:b w:val="1"/>
           <w:bCs w:val="1"/>
           <w:u w:val="single"/>
-          <w:rtl w:val="0"/>
-        </w:rPr>
-        <w:t xml:space="preserve">INTRODUCTION</w:t>
-      </w:r>
-      <w:r>
-        <w:rPr>
-          <w:rtl w:val="0"/>
-        </w:rPr>
-      </w:r>
-    </w:p>
-    <w:p>
-      <w:pPr>
-        <w:rPr>
-          <w:rFonts w:ascii="Calibri" w:cs="Calibri" w:eastAsia="Calibri" w:hAnsi="Calibri"/>
-        </w:rPr>
-      </w:pPr>
-      <w:r>
-        <w:rPr>
-          <w:rFonts w:ascii="Calibri" w:cs="Calibri" w:eastAsia="Calibri" w:hAnsi="Calibri"/>
-          <w:rtl w:val="0"/>
-        </w:rPr>
-        <w:t xml:space="preserve">You are being invited to take part in a medical research study. Before you decide to take part in this study, you should read this document. This document, called an informed consent document, explains the study. Please ask as many questions as needed so that you can decide if you want to participate in the study. This document may contain words that you do not understand. Please have the Study Doctor or study staff explain any words that you do not fully understand. Once you understand the study, and if you want to participate, you will be asked to sign and date this document and a copy will be given to you.</w:t>
-      </w:r>
-    </w:p>
-    <w:p>
-      <w:pPr>
-        <w:rPr>
-          <w:rFonts w:ascii="Calibri" w:cs="Calibri" w:eastAsia="Calibri" w:hAnsi="Calibri"/>
-        </w:rPr>
-      </w:pPr>
-      <w:r>
-        <w:rPr>
+        </w:rPr>
+      </w:pPr>
+      <w:r>
+        <w:rPr>
+          <w:rFonts w:ascii="Verdana" w:hAnsi="Verdana" w:eastAsia="Verdana" w:cs="Verdana"/>
+          <w:sz w:val="22"/>
           <w:rtl w:val="0"/>
         </w:rPr>
       </w:r>
@@ -503,45 +631,474 @@
     <w:p>
       <w:pPr>
         <w:keepNext w:val="1"/>
-        <w:ind w:right="6427"/>
-        <w:rPr>
-          <w:rFonts w:ascii="Calibri" w:cs="Calibri" w:eastAsia="Calibri" w:hAnsi="Calibri"/>
-        </w:rPr>
-      </w:pPr>
-      <w:r>
+        <w:spacing w:line="276" w:lineRule="auto"/>
+        <w:ind w:right="4368"/>
+        <w:rPr>
+          <w:rFonts w:ascii="Calibri" w:cs="Calibri" w:eastAsia="Calibri" w:hAnsi="Calibri"/>
+        </w:rPr>
+      </w:pPr>
+      <w:r>
+        <w:rPr>
+          <w:rFonts w:ascii="Verdana" w:cs="Verdana" w:eastAsia="Verdana" w:hAnsi="Verdana"/>
+          <w:b w:val="1"/>
+          <w:bCs w:val="1"/>
+          <w:sz w:val="22"/>
+          <w:u w:val="single"/>
+          <w:rtl w:val="0"/>
+        </w:rPr>
+        <w:t xml:space="preserve">WHAT WILL HAPPEN DURING THE STUDY</w:t>
+      </w:r>
+      <w:r>
+        <w:rPr>
+          <w:rFonts w:ascii="Verdana" w:hAnsi="Verdana" w:eastAsia="Verdana" w:cs="Verdana"/>
+          <w:sz w:val="22"/>
+          <w:rtl w:val="0"/>
+        </w:rPr>
+      </w:r>
+    </w:p>
+    <w:p>
+      <w:pPr>
+        <w:spacing w:line="276" w:lineRule="auto"/>
+        <w:rPr>
+          <w:rFonts w:ascii="Calibri" w:cs="Calibri" w:eastAsia="Calibri" w:hAnsi="Calibri"/>
+        </w:rPr>
+      </w:pPr>
+      <w:r>
+        <w:rPr>
+          <w:rFonts w:ascii="Verdana" w:cs="Verdana" w:eastAsia="Verdana" w:hAnsi="Verdana"/>
+          <w:sz w:val="22"/>
+          <w:rtl w:val="0"/>
+        </w:rPr>
+        <w:t xml:space="preserve">First, the study doctor will decide if you meet the requirements to be in the study. This is called “screening.” Screening does not guarantee entry into the study. There may be other reasons why you cannot participate in the study; the study doctor and/or the study staff will discuss this with you.</w:t>
+      </w:r>
+    </w:p>
+    <w:p>
+      <w:pPr>
+        <w:rPr>
+          <w:rFonts w:ascii="Calibri" w:cs="Calibri" w:eastAsia="Calibri" w:hAnsi="Calibri"/>
+        </w:rPr>
+      </w:pPr>
+      <w:r>
+        <w:rPr>
+          <w:rFonts w:ascii="Verdana" w:hAnsi="Verdana" w:eastAsia="Verdana" w:cs="Verdana"/>
+          <w:sz w:val="22"/>
+          <w:rtl w:val="0"/>
+        </w:rPr>
+      </w:r>
+    </w:p>
+    <w:p>
+      <w:pPr>
+        <w:spacing w:line="276" w:lineRule="auto"/>
+        <w:rPr>
+          <w:rFonts w:ascii="Calibri" w:cs="Calibri" w:eastAsia="Calibri" w:hAnsi="Calibri"/>
+        </w:rPr>
+      </w:pPr>
+      <w:r>
+        <w:rPr>
+          <w:rFonts w:ascii="Verdana" w:cs="Verdana" w:eastAsia="Verdana" w:hAnsi="Verdana"/>
+          <w:sz w:val="22"/>
+          <w:rtl w:val="0"/>
+        </w:rPr>
+        <w:t xml:space="preserve">You will have eye tests and procedures performed to help the study doctor decide if you can be in the study. </w:t>
+      </w:r>
+    </w:p>
+    <w:p>
+      <w:pPr>
+        <w:rPr>
+          <w:rFonts w:ascii="Calibri" w:cs="Calibri" w:eastAsia="Calibri" w:hAnsi="Calibri"/>
+        </w:rPr>
+      </w:pPr>
+      <w:r>
+        <w:rPr>
+          <w:rFonts w:ascii="Verdana" w:hAnsi="Verdana" w:eastAsia="Verdana" w:cs="Verdana"/>
+          <w:sz w:val="22"/>
+          <w:rtl w:val="0"/>
+        </w:rPr>
+      </w:r>
+    </w:p>
+    <w:p>
+      <w:pPr>
+        <w:keepNext w:val="1"/>
+        <w:spacing w:line="276" w:lineRule="auto"/>
+        <w:rPr>
+          <w:rFonts w:ascii="Calibri" w:cs="Calibri" w:eastAsia="Calibri" w:hAnsi="Calibri"/>
+        </w:rPr>
+      </w:pPr>
+      <w:r>
+        <w:rPr>
+          <w:rFonts w:ascii="Verdana" w:cs="Verdana" w:eastAsia="Verdana" w:hAnsi="Verdana"/>
+          <w:sz w:val="22"/>
+          <w:rtl w:val="0"/>
+        </w:rPr>
+        <w:t xml:space="preserve">To be eligible for the study, you need to meet certain requirements that include but are not limited to:</w:t>
+      </w:r>
+    </w:p>
+    <w:p>
+      <w:pPr>
+        <w:rPr>
+          <w:rFonts w:ascii="Calibri" w:cs="Calibri" w:eastAsia="Calibri" w:hAnsi="Calibri"/>
+        </w:rPr>
+      </w:pPr>
+      <w:r>
+        <w:rPr>
+          <w:rFonts w:ascii="Verdana" w:hAnsi="Verdana" w:eastAsia="Verdana" w:cs="Verdana"/>
+          <w:sz w:val="22"/>
+          <w:rtl w:val="0"/>
+        </w:rPr>
+      </w:r>
+    </w:p>
+    <w:p>
+      <w:pPr>
+        <w:spacing w:line="276" w:lineRule="auto"/>
+        <w:ind w:left="720" w:firstLine="0"/>
+        <w:jc w:val="both"/>
+        <w:rPr>
+          <w:rFonts w:ascii="Calibri" w:cs="Calibri" w:eastAsia="Calibri" w:hAnsi="Calibri"/>
+        </w:rPr>
+      </w:pPr>
+      <w:r>
+        <w:rPr>
+          <w:rFonts w:ascii="Verdana" w:cs="Verdana" w:eastAsia="Verdana" w:hAnsi="Verdana"/>
+          <w:sz w:val="22"/>
+          <w:rtl w:val="0"/>
+        </w:rPr>
+        <w:t xml:space="preserve">{inclusionCriteria}</w:t>
+      </w:r>
+    </w:p>
+    <w:p>
+      <w:pPr>
+        <w:ind w:left="714" w:firstLine="0"/>
+        <w:rPr>
+          <w:rFonts w:ascii="Calibri" w:cs="Calibri" w:eastAsia="Calibri" w:hAnsi="Calibri"/>
+        </w:rPr>
+      </w:pPr>
+      <w:r>
+        <w:rPr>
+          <w:rFonts w:ascii="Verdana" w:hAnsi="Verdana" w:eastAsia="Verdana" w:cs="Verdana"/>
+          <w:sz w:val="22"/>
+          <w:rtl w:val="0"/>
+        </w:rPr>
+      </w:r>
+    </w:p>
+    <w:p>
+      <w:pPr>
+        <w:spacing w:line="276" w:lineRule="auto"/>
+        <w:ind w:right="62"/>
+        <w:jc w:val="both"/>
+        <w:rPr>
+          <w:rFonts w:ascii="Calibri" w:cs="Calibri" w:eastAsia="Calibri" w:hAnsi="Calibri"/>
+        </w:rPr>
+      </w:pPr>
+      <w:r>
+        <w:rPr>
+          <w:rFonts w:ascii="Verdana" w:cs="Verdana" w:eastAsia="Verdana" w:hAnsi="Verdana"/>
+          <w:sz w:val="22"/>
+          <w:rtl w:val="0"/>
+        </w:rPr>
+        <w:t xml:space="preserve">{AI_icfVisitsOverview}</w:t>
+      </w:r>
+    </w:p>
+    <w:p>
+      <w:pPr>
+        <w:jc w:val="both"/>
+        <w:rPr>
+          <w:rFonts w:ascii="Calibri" w:cs="Calibri" w:eastAsia="Calibri" w:hAnsi="Calibri"/>
+        </w:rPr>
+      </w:pPr>
+      <w:r>
+        <w:rPr>
+          <w:rFonts w:ascii="Verdana" w:hAnsi="Verdana" w:eastAsia="Verdana" w:cs="Verdana"/>
+          <w:sz w:val="22"/>
+          <w:rtl w:val="0"/>
+        </w:rPr>
+      </w:r>
+    </w:p>
+    <w:p>
+      <w:pPr>
+        <w:spacing w:line="276" w:lineRule="auto"/>
+        <w:ind w:right="-20"/>
+        <w:jc w:val="both"/>
+        <w:rPr>
+          <w:rFonts w:ascii="Calibri" w:cs="Calibri" w:eastAsia="Calibri" w:hAnsi="Calibri"/>
+        </w:rPr>
+      </w:pPr>
+      <w:r>
+        <w:rPr>
+          <w:rFonts w:ascii="Verdana" w:cs="Verdana" w:eastAsia="Verdana" w:hAnsi="Verdana"/>
+          <w:sz w:val="22"/>
+          <w:rtl w:val="0"/>
+        </w:rPr>
+        <w:t xml:space="preserve">{AI_visitsDetails}</w:t>
+      </w:r>
+    </w:p>
+    <w:p>
+      <w:pPr>
+        <w:rPr>
+          <w:rFonts w:ascii="Calibri" w:cs="Calibri" w:eastAsia="Calibri" w:hAnsi="Calibri"/>
+        </w:rPr>
+      </w:pPr>
+      <w:r>
+        <w:rPr>
+          <w:rFonts w:ascii="Verdana" w:hAnsi="Verdana" w:eastAsia="Verdana" w:cs="Verdana"/>
+          <w:sz w:val="22"/>
+          <w:rtl w:val="0"/>
+        </w:rPr>
+      </w:r>
+    </w:p>
+    <w:p>
+      <w:pPr>
+        <w:keepNext w:val="1"/>
+        <w:spacing w:line="276" w:lineRule="auto"/>
+        <w:ind w:right="157"/>
+        <w:rPr>
+          <w:rFonts w:ascii="Calibri" w:cs="Calibri" w:eastAsia="Calibri" w:hAnsi="Calibri"/>
+        </w:rPr>
+      </w:pPr>
+      <w:r>
+        <w:rPr>
+          <w:rFonts w:ascii="Verdana" w:cs="Verdana" w:eastAsia="Verdana" w:hAnsi="Verdana"/>
+          <w:b w:val="1"/>
+          <w:bCs w:val="1"/>
+          <w:sz w:val="22"/>
+          <w:u w:val="single"/>
+          <w:rtl w:val="0"/>
+        </w:rPr>
+        <w:t xml:space="preserve">LENGTH OF THE STUDY AND NUMBER OF PARTICIPANTS EXPECTED </w:t>
+      </w:r>
+      <w:r>
+        <w:rPr>
+          <w:rFonts w:ascii="Verdana" w:hAnsi="Verdana" w:eastAsia="Verdana" w:cs="Verdana"/>
+          <w:sz w:val="22"/>
+          <w:rtl w:val="0"/>
+        </w:rPr>
+      </w:r>
+    </w:p>
+    <w:p>
+      <w:pPr>
+        <w:spacing w:line="276" w:lineRule="auto"/>
+        <w:ind w:right="155"/>
+        <w:rPr>
+          <w:rFonts w:ascii="Calibri" w:cs="Calibri" w:eastAsia="Calibri" w:hAnsi="Calibri"/>
+        </w:rPr>
+      </w:pPr>
+      <w:r>
+        <w:rPr>
+          <w:rFonts w:ascii="Verdana" w:cs="Verdana" w:eastAsia="Verdana" w:hAnsi="Verdana"/>
+          <w:sz w:val="22"/>
+          <w:rtl w:val="0"/>
+        </w:rPr>
+        <w:t xml:space="preserve">{AI_visitsAndLength}</w:t>
+      </w:r>
+    </w:p>
+    <w:p>
+      <w:pPr>
+        <w:ind w:right="4900"/>
         <w:rPr>
           <w:rFonts w:ascii="Calibri" w:cs="Calibri" w:eastAsia="Calibri" w:hAnsi="Calibri"/>
           <w:b w:val="1"/>
           <w:bCs w:val="1"/>
           <w:u w:val="single"/>
-          <w:rtl w:val="0"/>
-        </w:rPr>
-        <w:t xml:space="preserve">PURPOSE OF THE STUDY</w:t>
-      </w:r>
-      <w:r>
-        <w:rPr>
-          <w:rtl w:val="0"/>
-        </w:rPr>
-      </w:r>
-    </w:p>
-    <w:p>
-      <w:pPr>
-        <w:ind w:right="57"/>
-        <w:rPr>
-          <w:rFonts w:ascii="Calibri" w:cs="Calibri" w:eastAsia="Calibri" w:hAnsi="Calibri"/>
-        </w:rPr>
-      </w:pPr>
-      <w:r>
-        <w:rPr>
-          <w:rFonts w:ascii="Calibri" w:cs="Calibri" w:eastAsia="Calibri" w:hAnsi="Calibri"/>
-          <w:rtl w:val="0"/>
-        </w:rPr>
-        <w:t xml:space="preserve">{AI_studyPurpose}</w:t>
-      </w:r>
-    </w:p>
-    <w:p>
-      <w:pPr>
-        <w:ind w:right="57"/>
+        </w:rPr>
+      </w:pPr>
+      <w:r>
+        <w:rPr>
+          <w:rFonts w:ascii="Verdana" w:hAnsi="Verdana" w:eastAsia="Verdana" w:cs="Verdana"/>
+          <w:sz w:val="22"/>
+          <w:rtl w:val="0"/>
+        </w:rPr>
+      </w:r>
+    </w:p>
+    <w:p>
+      <w:pPr>
+        <w:keepNext w:val="1"/>
+        <w:spacing w:line="276" w:lineRule="auto"/>
+        <w:rPr>
+          <w:rFonts w:ascii="Calibri" w:cs="Calibri" w:eastAsia="Calibri" w:hAnsi="Calibri"/>
+        </w:rPr>
+      </w:pPr>
+      <w:r>
+        <w:rPr>
+          <w:rFonts w:ascii="Verdana" w:cs="Verdana" w:eastAsia="Verdana" w:hAnsi="Verdana"/>
+          <w:b w:val="1"/>
+          <w:bCs w:val="1"/>
+          <w:sz w:val="22"/>
+          <w:u w:val="single"/>
+          <w:rtl w:val="0"/>
+        </w:rPr>
+        <w:t xml:space="preserve">SIDE EFFECTS AND OTHER RISKS</w:t>
+      </w:r>
+      <w:r>
+        <w:rPr>
+          <w:rFonts w:ascii="Verdana" w:hAnsi="Verdana" w:eastAsia="Verdana" w:cs="Verdana"/>
+          <w:sz w:val="22"/>
+          <w:rtl w:val="0"/>
+        </w:rPr>
+      </w:r>
+    </w:p>
+    <w:p>
+      <w:pPr>
+        <w:spacing w:after="120" w:line="276" w:lineRule="auto"/>
+        <w:rPr>
+          <w:rFonts w:ascii="Calibri" w:cs="Calibri" w:eastAsia="Calibri" w:hAnsi="Calibri"/>
+        </w:rPr>
+      </w:pPr>
+      <w:r>
+        <w:rPr>
+          <w:rFonts w:ascii="Verdana" w:cs="Verdana" w:eastAsia="Verdana" w:hAnsi="Verdana"/>
+          <w:sz w:val="22"/>
+          <w:rtl w:val="0"/>
+        </w:rPr>
+        <w:t xml:space="preserve">Side effects and risks of this study are the same as would be expected after {interventionName}. There are no additional side effects or risks expected. </w:t>
+      </w:r>
+    </w:p>
+    <w:p>
+      <w:pPr>
+        <w:spacing w:after="120" w:line="276" w:lineRule="auto"/>
+        <w:rPr>
+          <w:rFonts w:ascii="Calibri" w:cs="Calibri" w:eastAsia="Calibri" w:hAnsi="Calibri"/>
+        </w:rPr>
+      </w:pPr>
+      <w:r>
+        <w:rPr>
+          <w:rFonts w:ascii="Verdana" w:cs="Verdana" w:eastAsia="Verdana" w:hAnsi="Verdana"/>
+          <w:sz w:val="22"/>
+          <w:rtl w:val="0"/>
+        </w:rPr>
+        <w:t xml:space="preserve">The following are possible side effects or complications of any {interventionName}:</w:t>
+      </w:r>
+    </w:p>
+    <w:p>
+      <w:pPr>
+        <w:spacing w:line="276" w:lineRule="auto"/>
+        <w:ind w:left="720" w:firstLine="0"/>
+        <w:jc w:val="both"/>
+        <w:rPr>
+          <w:rFonts w:ascii="Calibri" w:cs="Calibri" w:eastAsia="Calibri" w:hAnsi="Calibri"/>
+        </w:rPr>
+      </w:pPr>
+      <w:r>
+        <w:rPr>
+          <w:rFonts w:ascii="Verdana" w:cs="Verdana" w:eastAsia="Verdana" w:hAnsi="Verdana"/>
+          <w:sz w:val="22"/>
+          <w:rtl w:val="0"/>
+        </w:rPr>
+        <w:t xml:space="preserve">{AI_interventionPossibleSideEffects}</w:t>
+      </w:r>
+    </w:p>
+    <w:p>
+      <w:pPr>
+        <w:shd w:fill="ffffff" w:val="clear"/>
+        <w:jc w:val="both"/>
+        <w:rPr>
+          <w:rFonts w:ascii="Calibri" w:cs="Calibri" w:eastAsia="Calibri" w:hAnsi="Calibri"/>
+          <w:color w:val="202124"/>
+        </w:rPr>
+      </w:pPr>
+      <w:r>
+        <w:rPr>
+          <w:rFonts w:ascii="Verdana" w:hAnsi="Verdana" w:eastAsia="Verdana" w:cs="Verdana"/>
+          <w:sz w:val="22"/>
+          <w:rtl w:val="0"/>
+        </w:rPr>
+      </w:r>
+    </w:p>
+    <w:p>
+      <w:pPr>
+        <w:shd w:fill="ffffff" w:val="clear"/>
+        <w:spacing w:line="276" w:lineRule="auto"/>
+        <w:jc w:val="both"/>
+        <w:rPr>
+          <w:rFonts w:ascii="Calibri" w:cs="Calibri" w:eastAsia="Calibri" w:hAnsi="Calibri"/>
+          <w:color w:val="202124"/>
+        </w:rPr>
+      </w:pPr>
+      <w:r>
+        <w:rPr>
+          <w:rFonts w:ascii="Verdana" w:cs="Verdana" w:eastAsia="Verdana" w:hAnsi="Verdana"/>
+          <w:color w:val="202124"/>
+          <w:sz w:val="22"/>
+          <w:rtl w:val="0"/>
+        </w:rPr>
+        <w:t xml:space="preserve">You must tell the study doctor or study staff about all side effects that you have. If you are not honest about your side effects, it may not be safe for you to stay in the study.</w:t>
+      </w:r>
+    </w:p>
+    <w:p>
+      <w:pPr>
+        <w:rPr>
+          <w:rFonts w:ascii="Calibri" w:cs="Calibri" w:eastAsia="Calibri" w:hAnsi="Calibri"/>
+        </w:rPr>
+      </w:pPr>
+      <w:r>
+        <w:rPr>
+          <w:rFonts w:ascii="Verdana" w:hAnsi="Verdana" w:eastAsia="Verdana" w:cs="Verdana"/>
+          <w:sz w:val="22"/>
+          <w:rtl w:val="0"/>
+        </w:rPr>
+      </w:r>
+    </w:p>
+    <w:p>
+      <w:pPr>
+        <w:keepNext w:val="1"/>
+        <w:spacing w:line="276" w:lineRule="auto"/>
+        <w:ind w:right="5078"/>
+        <w:rPr>
+          <w:rFonts w:ascii="Calibri" w:cs="Calibri" w:eastAsia="Calibri" w:hAnsi="Calibri"/>
+        </w:rPr>
+      </w:pPr>
+      <w:r>
+        <w:rPr>
+          <w:rFonts w:ascii="Verdana" w:cs="Verdana" w:eastAsia="Verdana" w:hAnsi="Verdana"/>
+          <w:b w:val="1"/>
+          <w:bCs w:val="1"/>
+          <w:sz w:val="22"/>
+          <w:u w:val="single"/>
+          <w:rtl w:val="0"/>
+        </w:rPr>
+        <w:t xml:space="preserve">POSSIBLE BENEFITS OF THE STUDY</w:t>
+      </w:r>
+      <w:r>
+        <w:rPr>
+          <w:rFonts w:ascii="Verdana" w:hAnsi="Verdana" w:eastAsia="Verdana" w:cs="Verdana"/>
+          <w:sz w:val="22"/>
+          <w:rtl w:val="0"/>
+        </w:rPr>
+      </w:r>
+    </w:p>
+    <w:p>
+      <w:pPr>
+        <w:spacing w:line="276" w:lineRule="auto"/>
+        <w:rPr>
+          <w:rFonts w:ascii="Calibri" w:cs="Calibri" w:eastAsia="Calibri" w:hAnsi="Calibri"/>
+        </w:rPr>
+      </w:pPr>
+      <w:r>
+        <w:rPr>
+          <w:rFonts w:ascii="Verdana" w:cs="Verdana" w:eastAsia="Verdana" w:hAnsi="Verdana"/>
+          <w:sz w:val="22"/>
+          <w:rtl w:val="0"/>
+        </w:rPr>
+        <w:t xml:space="preserve">{AI_benefits}</w:t>
+      </w:r>
+    </w:p>
+    <w:p>
+      <w:pPr>
+        <w:rPr>
+          <w:rFonts w:ascii="Calibri" w:cs="Calibri" w:eastAsia="Calibri" w:hAnsi="Calibri"/>
+        </w:rPr>
+      </w:pPr>
+      <w:r>
+        <w:rPr>
+          <w:rFonts w:ascii="Verdana" w:hAnsi="Verdana" w:eastAsia="Verdana" w:cs="Verdana"/>
+          <w:sz w:val="22"/>
+          <w:rtl w:val="0"/>
+        </w:rPr>
+      </w:r>
+    </w:p>
+    <w:p>
+      <w:pPr>
+        <w:keepNext w:val="1"/>
+        <w:spacing w:line="276" w:lineRule="auto"/>
+        <w:ind w:right="5078"/>
         <w:rPr>
           <w:rFonts w:ascii="Calibri" w:cs="Calibri" w:eastAsia="Calibri" w:hAnsi="Calibri"/>
           <w:b w:val="1"/>
@@ -551,6 +1108,42 @@
       </w:pPr>
       <w:r>
         <w:rPr>
+          <w:rFonts w:ascii="Verdana" w:cs="Verdana" w:eastAsia="Verdana" w:hAnsi="Verdana"/>
+          <w:b w:val="1"/>
+          <w:bCs w:val="1"/>
+          <w:sz w:val="22"/>
+          <w:u w:val="single"/>
+          <w:rtl w:val="0"/>
+        </w:rPr>
+        <w:t xml:space="preserve">PAYMENT FOR BEING IN THE STUDY</w:t>
+      </w:r>
+    </w:p>
+    <w:p>
+      <w:pPr>
+        <w:spacing w:line="276" w:lineRule="auto"/>
+        <w:rPr>
+          <w:rFonts w:ascii="Calibri" w:cs="Calibri" w:eastAsia="Calibri" w:hAnsi="Calibri"/>
+        </w:rPr>
+      </w:pPr>
+      <w:r>
+        <w:rPr>
+          <w:rFonts w:ascii="Verdana" w:cs="Verdana" w:eastAsia="Verdana" w:hAnsi="Verdana"/>
+          <w:sz w:val="22"/>
+          <w:rtl w:val="0"/>
+        </w:rPr>
+        <w:t xml:space="preserve">{AI_payment}</w:t>
+      </w:r>
+    </w:p>
+    <w:p>
+      <w:pPr>
+        <w:rPr>
+          <w:rFonts w:ascii="Calibri" w:cs="Calibri" w:eastAsia="Calibri" w:hAnsi="Calibri"/>
+        </w:rPr>
+      </w:pPr>
+      <w:r>
+        <w:rPr>
+          <w:rFonts w:ascii="Verdana" w:hAnsi="Verdana" w:eastAsia="Verdana" w:cs="Verdana"/>
+          <w:sz w:val="22"/>
           <w:rtl w:val="0"/>
         </w:rPr>
       </w:r>
@@ -558,243 +1151,111 @@
     <w:p>
       <w:pPr>
         <w:keepNext w:val="1"/>
-        <w:ind w:right="4368"/>
-        <w:rPr>
-          <w:rFonts w:ascii="Calibri" w:cs="Calibri" w:eastAsia="Calibri" w:hAnsi="Calibri"/>
-        </w:rPr>
-      </w:pPr>
-      <w:r>
+        <w:spacing w:line="276" w:lineRule="auto"/>
         <w:rPr>
           <w:rFonts w:ascii="Calibri" w:cs="Calibri" w:eastAsia="Calibri" w:hAnsi="Calibri"/>
           <w:b w:val="1"/>
           <w:bCs w:val="1"/>
           <w:u w:val="single"/>
-          <w:rtl w:val="0"/>
-        </w:rPr>
-        <w:t xml:space="preserve">WHAT WILL HAPPEN DURING THE STUDY</w:t>
-      </w:r>
-      <w:r>
-        <w:rPr>
-          <w:rtl w:val="0"/>
-        </w:rPr>
-      </w:r>
-    </w:p>
-    <w:p>
-      <w:pPr>
-        <w:rPr>
-          <w:rFonts w:ascii="Calibri" w:cs="Calibri" w:eastAsia="Calibri" w:hAnsi="Calibri"/>
-        </w:rPr>
-      </w:pPr>
-      <w:r>
-        <w:rPr>
-          <w:rFonts w:ascii="Calibri" w:cs="Calibri" w:eastAsia="Calibri" w:hAnsi="Calibri"/>
-          <w:rtl w:val="0"/>
-        </w:rPr>
-        <w:t xml:space="preserve">First, the study doctor will decide if you meet the requirements to be in the study. This is called “screening.” Screening does not guarantee entry into the study. There may be other reasons why you cannot participate in the study; the study doctor and/or the study staff will discuss this with you.</w:t>
-      </w:r>
-    </w:p>
-    <w:p>
-      <w:pPr>
-        <w:rPr>
-          <w:rFonts w:ascii="Calibri" w:cs="Calibri" w:eastAsia="Calibri" w:hAnsi="Calibri"/>
-        </w:rPr>
-      </w:pPr>
-      <w:r>
-        <w:rPr>
-          <w:rtl w:val="0"/>
-        </w:rPr>
-      </w:r>
-    </w:p>
-    <w:p>
-      <w:pPr>
-        <w:rPr>
-          <w:rFonts w:ascii="Calibri" w:cs="Calibri" w:eastAsia="Calibri" w:hAnsi="Calibri"/>
-        </w:rPr>
-      </w:pPr>
-      <w:r>
-        <w:rPr>
-          <w:rFonts w:ascii="Calibri" w:cs="Calibri" w:eastAsia="Calibri" w:hAnsi="Calibri"/>
-          <w:rtl w:val="0"/>
-        </w:rPr>
-        <w:t xml:space="preserve">You will have eye tests and procedures performed to help the study doctor decide if you can be in the study. </w:t>
-      </w:r>
-    </w:p>
-    <w:p>
-      <w:pPr>
-        <w:rPr>
-          <w:rFonts w:ascii="Calibri" w:cs="Calibri" w:eastAsia="Calibri" w:hAnsi="Calibri"/>
-        </w:rPr>
-      </w:pPr>
-      <w:r>
-        <w:rPr>
-          <w:rtl w:val="0"/>
-        </w:rPr>
-      </w:r>
-    </w:p>
-    <w:p>
-      <w:pPr>
-        <w:keepNext w:val="1"/>
-        <w:rPr>
-          <w:rFonts w:ascii="Calibri" w:cs="Calibri" w:eastAsia="Calibri" w:hAnsi="Calibri"/>
-        </w:rPr>
-      </w:pPr>
-      <w:r>
-        <w:rPr>
-          <w:rFonts w:ascii="Calibri" w:cs="Calibri" w:eastAsia="Calibri" w:hAnsi="Calibri"/>
-          <w:rtl w:val="0"/>
-        </w:rPr>
-        <w:t xml:space="preserve">To be eligible for the study, you need to meet certain requirements that include but are not limited to:</w:t>
-      </w:r>
-    </w:p>
-    <w:p>
-      <w:pPr>
-        <w:rPr>
-          <w:rFonts w:ascii="Calibri" w:cs="Calibri" w:eastAsia="Calibri" w:hAnsi="Calibri"/>
-        </w:rPr>
-      </w:pPr>
-      <w:r>
-        <w:rPr>
-          <w:rtl w:val="0"/>
-        </w:rPr>
-      </w:r>
-    </w:p>
-    <w:p>
-      <w:pPr>
-        <w:ind w:left="720" w:firstLine="0"/>
-        <w:jc w:val="both"/>
-        <w:rPr>
-          <w:rFonts w:ascii="Calibri" w:cs="Calibri" w:eastAsia="Calibri" w:hAnsi="Calibri"/>
-        </w:rPr>
-      </w:pPr>
-      <w:r>
-        <w:rPr>
-          <w:rFonts w:ascii="Calibri" w:cs="Calibri" w:eastAsia="Calibri" w:hAnsi="Calibri"/>
-          <w:rtl w:val="0"/>
-        </w:rPr>
-        <w:t xml:space="preserve">{inclusionCriteria}</w:t>
-      </w:r>
-    </w:p>
-    <w:p>
-      <w:pPr>
-        <w:ind w:left="714" w:firstLine="0"/>
-        <w:rPr>
-          <w:rFonts w:ascii="Calibri" w:cs="Calibri" w:eastAsia="Calibri" w:hAnsi="Calibri"/>
-        </w:rPr>
-      </w:pPr>
-      <w:r>
-        <w:rPr>
-          <w:rtl w:val="0"/>
-        </w:rPr>
-      </w:r>
-    </w:p>
-    <w:p>
-      <w:pPr>
-        <w:ind w:right="62"/>
-        <w:jc w:val="both"/>
-        <w:rPr>
-          <w:rFonts w:ascii="Calibri" w:cs="Calibri" w:eastAsia="Calibri" w:hAnsi="Calibri"/>
-        </w:rPr>
-      </w:pPr>
-      <w:r>
-        <w:rPr>
-          <w:rFonts w:ascii="Calibri" w:cs="Calibri" w:eastAsia="Calibri" w:hAnsi="Calibri"/>
-          <w:rtl w:val="0"/>
-        </w:rPr>
-        <w:t xml:space="preserve">{AI_icfVisitsOverview}</w:t>
-      </w:r>
-    </w:p>
-    <w:p>
-      <w:pPr>
-        <w:jc w:val="both"/>
-        <w:rPr>
-          <w:rFonts w:ascii="Calibri" w:cs="Calibri" w:eastAsia="Calibri" w:hAnsi="Calibri"/>
-        </w:rPr>
-      </w:pPr>
-      <w:r>
-        <w:rPr>
-          <w:rtl w:val="0"/>
-        </w:rPr>
-      </w:r>
-    </w:p>
-    <w:p>
-      <w:pPr>
-        <w:ind w:right="-20"/>
-        <w:jc w:val="both"/>
-        <w:rPr>
-          <w:rFonts w:ascii="Calibri" w:cs="Calibri" w:eastAsia="Calibri" w:hAnsi="Calibri"/>
-        </w:rPr>
-      </w:pPr>
-      <w:r>
-        <w:rPr>
-          <w:rFonts w:ascii="Calibri" w:cs="Calibri" w:eastAsia="Calibri" w:hAnsi="Calibri"/>
-          <w:rtl w:val="0"/>
-        </w:rPr>
-        <w:t xml:space="preserve">{AI_visitsDetails}</w:t>
-      </w:r>
-    </w:p>
-    <w:p>
-      <w:pPr>
-        <w:rPr>
-          <w:rFonts w:ascii="Calibri" w:cs="Calibri" w:eastAsia="Calibri" w:hAnsi="Calibri"/>
-        </w:rPr>
-      </w:pPr>
-      <w:r>
-        <w:rPr>
-          <w:rtl w:val="0"/>
-        </w:rPr>
-      </w:r>
-    </w:p>
-    <w:p>
-      <w:pPr>
-        <w:keepNext w:val="1"/>
-        <w:ind w:right="157"/>
-        <w:rPr>
-          <w:rFonts w:ascii="Calibri" w:cs="Calibri" w:eastAsia="Calibri" w:hAnsi="Calibri"/>
-        </w:rPr>
-      </w:pPr>
-      <w:r>
-        <w:rPr>
-          <w:rFonts w:ascii="Calibri" w:cs="Calibri" w:eastAsia="Calibri" w:hAnsi="Calibri"/>
+        </w:rPr>
+      </w:pPr>
+      <w:r>
+        <w:rPr>
+          <w:rFonts w:ascii="Verdana" w:cs="Verdana" w:eastAsia="Verdana" w:hAnsi="Verdana"/>
           <w:b w:val="1"/>
           <w:bCs w:val="1"/>
+          <w:sz w:val="22"/>
           <w:u w:val="single"/>
           <w:rtl w:val="0"/>
         </w:rPr>
-        <w:t xml:space="preserve">LENGTH OF THE STUDY AND NUMBER OF PARTICIPANTS EXPECTED </w:t>
-      </w:r>
-      <w:r>
-        <w:rPr>
-          <w:rtl w:val="0"/>
-        </w:rPr>
-      </w:r>
-    </w:p>
-    <w:p>
-      <w:pPr>
-        <w:ind w:right="155"/>
-        <w:rPr>
-          <w:rFonts w:ascii="Calibri" w:cs="Calibri" w:eastAsia="Calibri" w:hAnsi="Calibri"/>
-        </w:rPr>
-      </w:pPr>
-      <w:r>
-        <w:rPr>
-          <w:rFonts w:ascii="Calibri" w:cs="Calibri" w:eastAsia="Calibri" w:hAnsi="Calibri"/>
-          <w:rtl w:val="0"/>
-        </w:rPr>
-        <w:t xml:space="preserve">{AI_visitsAndLength}</w:t>
-      </w:r>
-    </w:p>
-    <w:p>
-      <w:pPr>
-        <w:ind w:right="4900"/>
-        <w:rPr>
-          <w:rFonts w:ascii="Calibri" w:cs="Calibri" w:eastAsia="Calibri" w:hAnsi="Calibri"/>
+        <w:t xml:space="preserve">ADDITIONAL COSTS</w:t>
+      </w:r>
+    </w:p>
+    <w:p>
+      <w:pPr>
+        <w:spacing w:line="276" w:lineRule="auto"/>
+        <w:rPr>
+          <w:rFonts w:ascii="Calibri" w:cs="Calibri" w:eastAsia="Calibri" w:hAnsi="Calibri"/>
+        </w:rPr>
+      </w:pPr>
+      <w:r>
+        <w:rPr>
+          <w:rFonts w:ascii="Verdana" w:cs="Verdana" w:eastAsia="Verdana" w:hAnsi="Verdana"/>
+          <w:sz w:val="22"/>
+          <w:rtl w:val="0"/>
+        </w:rPr>
+        <w:t xml:space="preserve">There is no additional cost to you, your private medical insurance (if any), or the public health insurance plan, for study participation. </w:t>
+      </w:r>
+    </w:p>
+    <w:p>
+      <w:pPr>
+        <w:rPr>
+          <w:rFonts w:ascii="Calibri" w:cs="Calibri" w:eastAsia="Calibri" w:hAnsi="Calibri"/>
+        </w:rPr>
+      </w:pPr>
+      <w:r>
+        <w:rPr>
+          <w:rFonts w:ascii="Verdana" w:hAnsi="Verdana" w:eastAsia="Verdana" w:cs="Verdana"/>
+          <w:sz w:val="22"/>
+          <w:rtl w:val="0"/>
+        </w:rPr>
+      </w:r>
+    </w:p>
+    <w:p>
+      <w:pPr>
+        <w:keepNext w:val="1"/>
+        <w:spacing w:line="276" w:lineRule="auto"/>
+        <w:ind w:right="5082"/>
+        <w:rPr>
+          <w:rFonts w:ascii="Calibri" w:cs="Calibri" w:eastAsia="Calibri" w:hAnsi="Calibri"/>
+        </w:rPr>
+      </w:pPr>
+      <w:r>
+        <w:rPr>
+          <w:rFonts w:ascii="Verdana" w:cs="Verdana" w:eastAsia="Verdana" w:hAnsi="Verdana"/>
           <w:b w:val="1"/>
           <w:bCs w:val="1"/>
+          <w:sz w:val="22"/>
           <w:u w:val="single"/>
-        </w:rPr>
-      </w:pPr>
-      <w:r>
-        <w:rPr>
+          <w:rtl w:val="0"/>
+        </w:rPr>
+        <w:t xml:space="preserve">ALTERNATIVES TO PARTICIPATION</w:t>
+      </w:r>
+      <w:r>
+        <w:rPr>
+          <w:rFonts w:ascii="Verdana" w:hAnsi="Verdana" w:eastAsia="Verdana" w:cs="Verdana"/>
+          <w:sz w:val="22"/>
+          <w:rtl w:val="0"/>
+        </w:rPr>
+      </w:r>
+    </w:p>
+    <w:p>
+      <w:pPr>
+        <w:spacing w:line="276" w:lineRule="auto"/>
+        <w:rPr>
+          <w:rFonts w:ascii="Calibri" w:cs="Calibri" w:eastAsia="Calibri" w:hAnsi="Calibri"/>
+        </w:rPr>
+      </w:pPr>
+      <w:r>
+        <w:rPr>
+          <w:rFonts w:ascii="Verdana" w:cs="Verdana" w:eastAsia="Verdana" w:hAnsi="Verdana"/>
+          <w:sz w:val="22"/>
+          <w:rtl w:val="0"/>
+        </w:rPr>
+        <w:t xml:space="preserve">This research study is for research purposes only. You may choose not to participate in this research study. Your care at this facility will not be affected by your decision. </w:t>
+      </w:r>
+    </w:p>
+    <w:p>
+      <w:pPr>
+        <w:ind w:right="55"/>
+        <w:rPr>
+          <w:rFonts w:ascii="Calibri" w:cs="Calibri" w:eastAsia="Calibri" w:hAnsi="Calibri"/>
+        </w:rPr>
+      </w:pPr>
+      <w:r>
+        <w:rPr>
+          <w:rFonts w:ascii="Verdana" w:hAnsi="Verdana" w:eastAsia="Verdana" w:cs="Verdana"/>
+          <w:sz w:val="22"/>
           <w:rtl w:val="0"/>
         </w:rPr>
       </w:r>
@@ -802,113 +1263,27 @@
     <w:p>
       <w:pPr>
         <w:keepNext w:val="1"/>
-        <w:rPr>
-          <w:rFonts w:ascii="Calibri" w:cs="Calibri" w:eastAsia="Calibri" w:hAnsi="Calibri"/>
-        </w:rPr>
-      </w:pPr>
-      <w:r>
-        <w:rPr>
-          <w:rFonts w:ascii="Calibri" w:cs="Calibri" w:eastAsia="Calibri" w:hAnsi="Calibri"/>
+        <w:spacing w:line="276" w:lineRule="auto"/>
+        <w:ind w:right="3739"/>
+        <w:rPr>
+          <w:rFonts w:ascii="Calibri" w:cs="Calibri" w:eastAsia="Calibri" w:hAnsi="Calibri"/>
+        </w:rPr>
+      </w:pPr>
+      <w:r>
+        <w:rPr>
+          <w:rFonts w:ascii="Verdana" w:cs="Verdana" w:eastAsia="Verdana" w:hAnsi="Verdana"/>
           <w:b w:val="1"/>
           <w:bCs w:val="1"/>
+          <w:sz w:val="22"/>
           <w:u w:val="single"/>
           <w:rtl w:val="0"/>
         </w:rPr>
-        <w:t xml:space="preserve">SIDE EFFECTS AND OTHER RISKS</w:t>
-      </w:r>
-      <w:r>
-        <w:rPr>
-          <w:rtl w:val="0"/>
-        </w:rPr>
-      </w:r>
-    </w:p>
-    <w:p>
-      <w:pPr>
-        <w:spacing w:after="120" w:line="480" w:lineRule="auto"/>
-        <w:rPr>
-          <w:rFonts w:ascii="Calibri" w:cs="Calibri" w:eastAsia="Calibri" w:hAnsi="Calibri"/>
-        </w:rPr>
-      </w:pPr>
-      <w:r>
-        <w:rPr>
-          <w:rFonts w:ascii="Calibri" w:cs="Calibri" w:eastAsia="Calibri" w:hAnsi="Calibri"/>
-          <w:rtl w:val="0"/>
-        </w:rPr>
-        <w:t xml:space="preserve">Side effects and risks of this study are the same as would be expected after {interventionName}. There are no additional side effects or risks expected. </w:t>
-      </w:r>
-    </w:p>
-    <w:p>
-      <w:pPr>
-        <w:spacing w:after="120" w:line="480" w:lineRule="auto"/>
-        <w:rPr>
-          <w:rFonts w:ascii="Calibri" w:cs="Calibri" w:eastAsia="Calibri" w:hAnsi="Calibri"/>
-        </w:rPr>
-      </w:pPr>
-      <w:r>
-        <w:rPr>
-          <w:rFonts w:ascii="Calibri" w:cs="Calibri" w:eastAsia="Calibri" w:hAnsi="Calibri"/>
-          <w:rtl w:val="0"/>
-        </w:rPr>
-        <w:t xml:space="preserve">The following are possible side effects or complications of any {interventionName}:</w:t>
-      </w:r>
-    </w:p>
-    <w:p>
-      <w:pPr>
-        <w:ind w:left="720" w:firstLine="0"/>
-        <w:jc w:val="both"/>
-        <w:rPr>
-          <w:rFonts w:ascii="Calibri" w:cs="Calibri" w:eastAsia="Calibri" w:hAnsi="Calibri"/>
-        </w:rPr>
-      </w:pPr>
-      <w:r>
-        <w:rPr>
-          <w:rFonts w:ascii="Calibri" w:cs="Calibri" w:eastAsia="Calibri" w:hAnsi="Calibri"/>
-          <w:rtl w:val="0"/>
-        </w:rPr>
-        <w:t xml:space="preserve">{AI_interventionPossibleSideEffects}</w:t>
-      </w:r>
-    </w:p>
-    <w:p>
-      <w:pPr>
-        <w:shd w:fill="ffffff" w:val="clear"/>
-        <w:jc w:val="both"/>
-        <w:rPr>
-          <w:rFonts w:ascii="Calibri" w:cs="Calibri" w:eastAsia="Calibri" w:hAnsi="Calibri"/>
-          <w:color w:val="202124"/>
-        </w:rPr>
-      </w:pPr>
-      <w:r>
-        <w:rPr>
-          <w:rtl w:val="0"/>
-        </w:rPr>
-      </w:r>
-    </w:p>
-    <w:p>
-      <w:pPr>
-        <w:shd w:fill="ffffff" w:val="clear"/>
-        <w:jc w:val="both"/>
-        <w:rPr>
-          <w:rFonts w:ascii="Calibri" w:cs="Calibri" w:eastAsia="Calibri" w:hAnsi="Calibri"/>
-          <w:color w:val="202124"/>
-        </w:rPr>
-      </w:pPr>
-      <w:r>
-        <w:rPr>
-          <w:rFonts w:ascii="Calibri" w:cs="Calibri" w:eastAsia="Calibri" w:hAnsi="Calibri"/>
-          <w:color w:val="202124"/>
-          <w:rtl w:val="0"/>
-        </w:rPr>
-        <w:t xml:space="preserve">You must tell the study doctor or study staff about all side effects that you have. If you are not honest about your side effects, it may not be safe for you to stay in the study.</w:t>
-      </w:r>
-    </w:p>
-    <w:p>
-      <w:pPr>
-        <w:rPr>
-          <w:rFonts w:ascii="Calibri" w:cs="Calibri" w:eastAsia="Calibri" w:hAnsi="Calibri"/>
-        </w:rPr>
-      </w:pPr>
-      <w:r>
-        <w:rPr>
+        <w:t xml:space="preserve">RELEASE OF MEDICAL RECORDS AND PRIVACY</w:t>
+      </w:r>
+      <w:r>
+        <w:rPr>
+          <w:rFonts w:ascii="Verdana" w:hAnsi="Verdana" w:eastAsia="Verdana" w:cs="Verdana"/>
+          <w:sz w:val="22"/>
           <w:rtl w:val="0"/>
         </w:rPr>
       </w:r>
@@ -916,188 +1291,7 @@
     <w:p>
       <w:pPr>
         <w:keepNext w:val="1"/>
-        <w:ind w:right="5078"/>
-        <w:rPr>
-          <w:rFonts w:ascii="Calibri" w:cs="Calibri" w:eastAsia="Calibri" w:hAnsi="Calibri"/>
-        </w:rPr>
-      </w:pPr>
-      <w:r>
-        <w:rPr>
-          <w:rFonts w:ascii="Calibri" w:cs="Calibri" w:eastAsia="Calibri" w:hAnsi="Calibri"/>
-          <w:b w:val="1"/>
-          <w:bCs w:val="1"/>
-          <w:u w:val="single"/>
-          <w:rtl w:val="0"/>
-        </w:rPr>
-        <w:t xml:space="preserve">POSSIBLE BENEFITS OF THE STUDY</w:t>
-      </w:r>
-      <w:r>
-        <w:rPr>
-          <w:rtl w:val="0"/>
-        </w:rPr>
-      </w:r>
-    </w:p>
-    <w:p>
-      <w:pPr>
-        <w:rPr>
-          <w:rFonts w:ascii="Calibri" w:cs="Calibri" w:eastAsia="Calibri" w:hAnsi="Calibri"/>
-        </w:rPr>
-      </w:pPr>
-      <w:r>
-        <w:rPr>
-          <w:rFonts w:ascii="Calibri" w:cs="Calibri" w:eastAsia="Calibri" w:hAnsi="Calibri"/>
-          <w:rtl w:val="0"/>
-        </w:rPr>
-        <w:t xml:space="preserve">{AI_benefits}</w:t>
-      </w:r>
-    </w:p>
-    <w:p>
-      <w:pPr>
-        <w:rPr>
-          <w:rFonts w:ascii="Calibri" w:cs="Calibri" w:eastAsia="Calibri" w:hAnsi="Calibri"/>
-        </w:rPr>
-      </w:pPr>
-      <w:r>
-        <w:rPr>
-          <w:rtl w:val="0"/>
-        </w:rPr>
-      </w:r>
-    </w:p>
-    <w:p>
-      <w:pPr>
-        <w:keepNext w:val="1"/>
-        <w:ind w:right="5078"/>
-        <w:rPr>
-          <w:rFonts w:ascii="Calibri" w:cs="Calibri" w:eastAsia="Calibri" w:hAnsi="Calibri"/>
-          <w:b w:val="1"/>
-          <w:bCs w:val="1"/>
-          <w:u w:val="single"/>
-        </w:rPr>
-      </w:pPr>
-      <w:r>
-        <w:rPr>
-          <w:rFonts w:ascii="Calibri" w:cs="Calibri" w:eastAsia="Calibri" w:hAnsi="Calibri"/>
-          <w:b w:val="1"/>
-          <w:bCs w:val="1"/>
-          <w:u w:val="single"/>
-          <w:rtl w:val="0"/>
-        </w:rPr>
-        <w:t xml:space="preserve">PAYMENT FOR BEING IN THE STUDY</w:t>
-      </w:r>
-    </w:p>
-    <w:p>
-      <w:pPr>
-        <w:rPr>
-          <w:rFonts w:ascii="Calibri" w:cs="Calibri" w:eastAsia="Calibri" w:hAnsi="Calibri"/>
-        </w:rPr>
-      </w:pPr>
-      <w:r>
-        <w:rPr>
-          <w:rFonts w:ascii="Calibri" w:cs="Calibri" w:eastAsia="Calibri" w:hAnsi="Calibri"/>
-          <w:rtl w:val="0"/>
-        </w:rPr>
-        <w:t xml:space="preserve">{AI_payment}</w:t>
-      </w:r>
-    </w:p>
-    <w:p>
-      <w:pPr>
-        <w:rPr>
-          <w:rFonts w:ascii="Calibri" w:cs="Calibri" w:eastAsia="Calibri" w:hAnsi="Calibri"/>
-        </w:rPr>
-      </w:pPr>
-      <w:r>
-        <w:rPr>
-          <w:rtl w:val="0"/>
-        </w:rPr>
-      </w:r>
-    </w:p>
-    <w:p>
-      <w:pPr>
-        <w:keepNext w:val="1"/>
-        <w:rPr>
-          <w:rFonts w:ascii="Calibri" w:cs="Calibri" w:eastAsia="Calibri" w:hAnsi="Calibri"/>
-          <w:b w:val="1"/>
-          <w:bCs w:val="1"/>
-          <w:u w:val="single"/>
-        </w:rPr>
-      </w:pPr>
-      <w:r>
-        <w:rPr>
-          <w:rFonts w:ascii="Calibri" w:cs="Calibri" w:eastAsia="Calibri" w:hAnsi="Calibri"/>
-          <w:b w:val="1"/>
-          <w:bCs w:val="1"/>
-          <w:u w:val="single"/>
-          <w:rtl w:val="0"/>
-        </w:rPr>
-        <w:t xml:space="preserve">ADDITIONAL COSTS</w:t>
-      </w:r>
-    </w:p>
-    <w:p>
-      <w:pPr>
-        <w:rPr>
-          <w:rFonts w:ascii="Calibri" w:cs="Calibri" w:eastAsia="Calibri" w:hAnsi="Calibri"/>
-        </w:rPr>
-      </w:pPr>
-      <w:r>
-        <w:rPr>
-          <w:rFonts w:ascii="Calibri" w:cs="Calibri" w:eastAsia="Calibri" w:hAnsi="Calibri"/>
-          <w:rtl w:val="0"/>
-        </w:rPr>
-        <w:t xml:space="preserve">There is no additional cost to you, your private medical insurance (if any), or the public health insurance plan, for study participation. </w:t>
-      </w:r>
-    </w:p>
-    <w:p>
-      <w:pPr>
-        <w:rPr>
-          <w:rFonts w:ascii="Calibri" w:cs="Calibri" w:eastAsia="Calibri" w:hAnsi="Calibri"/>
-        </w:rPr>
-      </w:pPr>
-      <w:r>
-        <w:rPr>
-          <w:rtl w:val="0"/>
-        </w:rPr>
-      </w:r>
-    </w:p>
-    <w:p>
-      <w:pPr>
-        <w:keepNext w:val="1"/>
-        <w:ind w:right="5082"/>
-        <w:rPr>
-          <w:rFonts w:ascii="Calibri" w:cs="Calibri" w:eastAsia="Calibri" w:hAnsi="Calibri"/>
-        </w:rPr>
-      </w:pPr>
-      <w:r>
-        <w:rPr>
-          <w:rFonts w:ascii="Calibri" w:cs="Calibri" w:eastAsia="Calibri" w:hAnsi="Calibri"/>
-          <w:b w:val="1"/>
-          <w:bCs w:val="1"/>
-          <w:u w:val="single"/>
-          <w:rtl w:val="0"/>
-        </w:rPr>
-        <w:t xml:space="preserve">ALTERNATIVES TO PARTICIPATION</w:t>
-      </w:r>
-      <w:r>
-        <w:rPr>
-          <w:rtl w:val="0"/>
-        </w:rPr>
-      </w:r>
-    </w:p>
-    <w:p>
-      <w:pPr>
-        <w:rPr>
-          <w:rFonts w:ascii="Calibri" w:cs="Calibri" w:eastAsia="Calibri" w:hAnsi="Calibri"/>
-        </w:rPr>
-      </w:pPr>
-      <w:r>
-        <w:rPr>
-          <w:rFonts w:ascii="Calibri" w:cs="Calibri" w:eastAsia="Calibri" w:hAnsi="Calibri"/>
-          <w:rtl w:val="0"/>
-        </w:rPr>
-        <w:t xml:space="preserve">This research study is for research purposes only. You may choose not to participate in this research study. Your care at this facility will not be affected by your decision. </w:t>
-      </w:r>
-    </w:p>
-    <w:p>
-      <w:pPr>
+        <w:spacing w:line="276" w:lineRule="auto"/>
         <w:ind w:right="55"/>
         <w:rPr>
           <w:rFonts w:ascii="Calibri" w:cs="Calibri" w:eastAsia="Calibri" w:hAnsi="Calibri"/>
@@ -1105,32 +1299,11 @@
       </w:pPr>
       <w:r>
         <w:rPr>
-          <w:rtl w:val="0"/>
-        </w:rPr>
-      </w:r>
-    </w:p>
-    <w:p>
-      <w:pPr>
-        <w:keepNext w:val="1"/>
-        <w:ind w:right="3739"/>
-        <w:rPr>
-          <w:rFonts w:ascii="Calibri" w:cs="Calibri" w:eastAsia="Calibri" w:hAnsi="Calibri"/>
-        </w:rPr>
-      </w:pPr>
-      <w:r>
-        <w:rPr>
-          <w:rFonts w:ascii="Calibri" w:cs="Calibri" w:eastAsia="Calibri" w:hAnsi="Calibri"/>
-          <w:b w:val="1"/>
-          <w:bCs w:val="1"/>
-          <w:u w:val="single"/>
-          <w:rtl w:val="0"/>
-        </w:rPr>
-        <w:t xml:space="preserve">RELEASE OF MEDICAL RECORDS AND PRIVACY</w:t>
-      </w:r>
-      <w:r>
-        <w:rPr>
-          <w:rtl w:val="0"/>
-        </w:rPr>
+          <w:rFonts w:ascii="Verdana" w:cs="Verdana" w:eastAsia="Verdana" w:hAnsi="Verdana"/>
+          <w:sz w:val="22"/>
+          <w:rtl w:val="0"/>
+        </w:rPr>
+        <w:t xml:space="preserve">Your study records will be kept private. There may be times when the study doctor will not be able to guarantee privacy, such as when your study medical records are requested by a court of law or when shared with a firm in another country that does not have privacy regulations in place. Advarra Institutional Review Board (IRB) and accrediting agencies may inspect and copy your records, which may have your name on them. Therefore, your total privacy cannot be guaranteed. If information from this study is published or presented at scientific meetings, your name and other personal information will not be used. The following people will have access to your study records in order to monitor the research and verify the accuracy of the study data:</w:t>
       </w:r>
     </w:p>
     <w:p>
@@ -1143,22 +1316,8 @@
       </w:pPr>
       <w:r>
         <w:rPr>
-          <w:rFonts w:ascii="Calibri" w:cs="Calibri" w:eastAsia="Calibri" w:hAnsi="Calibri"/>
-          <w:rtl w:val="0"/>
-        </w:rPr>
-        <w:t xml:space="preserve">Your study records will be kept private. There may be times when the study doctor will not be able to guarantee privacy, such as when your study medical records are requested by a court of law or when shared with a firm in another country that does not have privacy regulations in place. Advarra Institutional Review Board (IRB) and accrediting agencies may inspect and copy your records, which may have your name on them. Therefore, your total privacy cannot be guaranteed. If information from this study is published or presented at scientific meetings, your name and other personal information will not be used. The following people will have access to your study records in order to monitor the research and verify the accuracy of the study data:</w:t>
-      </w:r>
-    </w:p>
-    <w:p>
-      <w:pPr>
-        <w:keepNext w:val="1"/>
-        <w:ind w:right="55"/>
-        <w:rPr>
-          <w:rFonts w:ascii="Calibri" w:cs="Calibri" w:eastAsia="Calibri" w:hAnsi="Calibri"/>
-        </w:rPr>
-      </w:pPr>
-      <w:r>
-        <w:rPr>
+          <w:rFonts w:ascii="Verdana" w:hAnsi="Verdana" w:eastAsia="Verdana" w:cs="Verdana"/>
+          <w:sz w:val="22"/>
           <w:rtl w:val="0"/>
         </w:rPr>
       </w:r>
@@ -1170,6 +1329,7 @@
           <w:ilvl w:val="0"/>
           <w:numId w:val="1"/>
         </w:numPr>
+        <w:spacing w:line="276" w:lineRule="auto"/>
         <w:ind w:left="720" w:right="27" w:hanging="360"/>
         <w:rPr>
           <w:rFonts w:ascii="Calibri" w:cs="Calibri" w:eastAsia="Calibri" w:hAnsi="Calibri"/>
@@ -1177,7 +1337,8 @@
       </w:pPr>
       <w:r>
         <w:rPr>
-          <w:rFonts w:ascii="Calibri" w:cs="Calibri" w:eastAsia="Calibri" w:hAnsi="Calibri"/>
+          <w:rFonts w:ascii="Verdana" w:cs="Verdana" w:eastAsia="Verdana" w:hAnsi="Verdana"/>
+          <w:sz w:val="22"/>
           <w:rtl w:val="0"/>
         </w:rPr>
         <w:t xml:space="preserve">Study Doctors</w:t>
@@ -1190,6 +1351,7 @@
           <w:ilvl w:val="0"/>
           <w:numId w:val="1"/>
         </w:numPr>
+        <w:spacing w:line="276" w:lineRule="auto"/>
         <w:ind w:left="720" w:right="27" w:hanging="360"/>
         <w:rPr>
           <w:rFonts w:ascii="Calibri" w:cs="Calibri" w:eastAsia="Calibri" w:hAnsi="Calibri"/>
@@ -1197,7 +1359,8 @@
       </w:pPr>
       <w:r>
         <w:rPr>
-          <w:rFonts w:ascii="Calibri" w:cs="Calibri" w:eastAsia="Calibri" w:hAnsi="Calibri"/>
+          <w:rFonts w:ascii="Verdana" w:cs="Verdana" w:eastAsia="Verdana" w:hAnsi="Verdana"/>
+          <w:sz w:val="22"/>
           <w:rtl w:val="0"/>
         </w:rPr>
         <w:t xml:space="preserve">Study Monitor or Auditor</w:t>
@@ -1210,6 +1373,7 @@
           <w:ilvl w:val="0"/>
           <w:numId w:val="1"/>
         </w:numPr>
+        <w:spacing w:line="276" w:lineRule="auto"/>
         <w:ind w:left="720" w:right="27" w:hanging="360"/>
         <w:rPr>
           <w:rFonts w:ascii="Calibri" w:cs="Calibri" w:eastAsia="Calibri" w:hAnsi="Calibri"/>
@@ -1217,7 +1381,8 @@
       </w:pPr>
       <w:r>
         <w:rPr>
-          <w:rFonts w:ascii="Calibri" w:cs="Calibri" w:eastAsia="Calibri" w:hAnsi="Calibri"/>
+          <w:rFonts w:ascii="Verdana" w:cs="Verdana" w:eastAsia="Verdana" w:hAnsi="Verdana"/>
+          <w:sz w:val="22"/>
           <w:rtl w:val="0"/>
         </w:rPr>
         <w:t xml:space="preserve">Sponsor Company or Research Institution</w:t>
@@ -1230,6 +1395,7 @@
           <w:ilvl w:val="0"/>
           <w:numId w:val="1"/>
         </w:numPr>
+        <w:spacing w:line="276" w:lineRule="auto"/>
         <w:ind w:left="720" w:right="27" w:hanging="360"/>
         <w:rPr>
           <w:rFonts w:ascii="Calibri" w:cs="Calibri" w:eastAsia="Calibri" w:hAnsi="Calibri"/>
@@ -1237,7 +1403,8 @@
       </w:pPr>
       <w:r>
         <w:rPr>
-          <w:rFonts w:ascii="Calibri" w:cs="Calibri" w:eastAsia="Calibri" w:hAnsi="Calibri"/>
+          <w:rFonts w:ascii="Verdana" w:cs="Verdana" w:eastAsia="Verdana" w:hAnsi="Verdana"/>
+          <w:sz w:val="22"/>
           <w:rtl w:val="0"/>
         </w:rPr>
         <w:t xml:space="preserve">{irbName} IRB (an independent ethics committee that reviewed the ethical aspects of this study to help protect the rights and welfare of study participants)</w:t>
@@ -1249,6 +1416,7 @@
           <w:ilvl w:val="0"/>
           <w:numId w:val="1"/>
         </w:numPr>
+        <w:spacing w:line="276" w:lineRule="auto"/>
         <w:ind w:left="720" w:hanging="360"/>
         <w:rPr>
           <w:rFonts w:ascii="Calibri" w:cs="Calibri" w:eastAsia="Calibri" w:hAnsi="Calibri"/>
@@ -1256,7 +1424,8 @@
       </w:pPr>
       <w:r>
         <w:rPr>
-          <w:rFonts w:ascii="Calibri" w:cs="Calibri" w:eastAsia="Calibri" w:hAnsi="Calibri"/>
+          <w:rFonts w:ascii="Verdana" w:cs="Verdana" w:eastAsia="Verdana" w:hAnsi="Verdana"/>
+          <w:sz w:val="22"/>
           <w:rtl w:val="0"/>
         </w:rPr>
         <w:t xml:space="preserve">Government regulatory authorities including the US Food and Drug Administration (FDA) and other foreign regulatory agencies</w:t>
@@ -1271,12 +1440,15 @@
       </w:pPr>
       <w:r>
         <w:rPr>
-          <w:rtl w:val="0"/>
-        </w:rPr>
-      </w:r>
-    </w:p>
-    <w:p>
-      <w:pPr>
+          <w:rFonts w:ascii="Verdana" w:hAnsi="Verdana" w:eastAsia="Verdana" w:cs="Verdana"/>
+          <w:sz w:val="22"/>
+          <w:rtl w:val="0"/>
+        </w:rPr>
+      </w:r>
+    </w:p>
+    <w:p>
+      <w:pPr>
+        <w:spacing w:line="276" w:lineRule="auto"/>
         <w:ind w:right="56"/>
         <w:rPr>
           <w:rFonts w:ascii="Calibri" w:cs="Calibri" w:eastAsia="Calibri" w:hAnsi="Calibri"/>
@@ -1284,7 +1456,8 @@
       </w:pPr>
       <w:r>
         <w:rPr>
-          <w:rFonts w:ascii="Calibri" w:cs="Calibri" w:eastAsia="Calibri" w:hAnsi="Calibri"/>
+          <w:rFonts w:ascii="Verdana" w:cs="Verdana" w:eastAsia="Verdana" w:hAnsi="Verdana"/>
+          <w:sz w:val="22"/>
           <w:rtl w:val="0"/>
         </w:rPr>
         <w:t xml:space="preserve">{irbName} IRB has reviewed this study and this informed consent document. {irbName} IRB is a committee of scientific and non-scientific individuals who review research studies by following the federal laws. This group is also required by the federal regulations to provide periodic review of ongoing research studies.</w:t>
@@ -1299,19 +1472,23 @@
       </w:pPr>
       <w:r>
         <w:rPr>
-          <w:rtl w:val="0"/>
-        </w:rPr>
-      </w:r>
-    </w:p>
-    <w:p>
-      <w:pPr>
-        <w:rPr>
-          <w:rFonts w:ascii="Calibri" w:cs="Calibri" w:eastAsia="Calibri" w:hAnsi="Calibri"/>
-        </w:rPr>
-      </w:pPr>
-      <w:r>
-        <w:rPr>
-          <w:rFonts w:ascii="Calibri" w:cs="Calibri" w:eastAsia="Calibri" w:hAnsi="Calibri"/>
+          <w:rFonts w:ascii="Verdana" w:hAnsi="Verdana" w:eastAsia="Verdana" w:cs="Verdana"/>
+          <w:sz w:val="22"/>
+          <w:rtl w:val="0"/>
+        </w:rPr>
+      </w:r>
+    </w:p>
+    <w:p>
+      <w:pPr>
+        <w:spacing w:line="276" w:lineRule="auto"/>
+        <w:rPr>
+          <w:rFonts w:ascii="Calibri" w:cs="Calibri" w:eastAsia="Calibri" w:hAnsi="Calibri"/>
+        </w:rPr>
+      </w:pPr>
+      <w:r>
+        <w:rPr>
+          <w:rFonts w:ascii="Verdana" w:cs="Verdana" w:eastAsia="Verdana" w:hAnsi="Verdana"/>
+          <w:sz w:val="22"/>
           <w:rtl w:val="0"/>
         </w:rPr>
         <w:t xml:space="preserve">Your study records including confidential information about you collected during the study will be kept at a secure location. </w:t>
@@ -1319,13 +1496,15 @@
     </w:p>
     <w:p>
       <w:pPr>
-        <w:rPr>
-          <w:rFonts w:ascii="Calibri" w:cs="Calibri" w:eastAsia="Calibri" w:hAnsi="Calibri"/>
-        </w:rPr>
-      </w:pPr>
-      <w:r>
-        <w:rPr>
-          <w:rFonts w:ascii="Calibri" w:cs="Calibri" w:eastAsia="Calibri" w:hAnsi="Calibri"/>
+        <w:spacing w:line="276" w:lineRule="auto"/>
+        <w:rPr>
+          <w:rFonts w:ascii="Calibri" w:cs="Calibri" w:eastAsia="Calibri" w:hAnsi="Calibri"/>
+        </w:rPr>
+      </w:pPr>
+      <w:r>
+        <w:rPr>
+          <w:rFonts w:ascii="Verdana" w:cs="Verdana" w:eastAsia="Verdana" w:hAnsi="Verdana"/>
+          <w:sz w:val="22"/>
           <w:rtl w:val="0"/>
         </w:rPr>
         <w:t xml:space="preserve">By signing and dating this information and consent form, you consent to the collection, access, use and disclosure of your information as described above.</w:t>
@@ -1339,19 +1518,23 @@
       </w:pPr>
       <w:r>
         <w:rPr>
-          <w:rtl w:val="0"/>
-        </w:rPr>
-      </w:r>
-    </w:p>
-    <w:p>
-      <w:pPr>
-        <w:rPr>
-          <w:rFonts w:ascii="Calibri" w:cs="Calibri" w:eastAsia="Calibri" w:hAnsi="Calibri"/>
-        </w:rPr>
-      </w:pPr>
-      <w:r>
-        <w:rPr>
-          <w:rFonts w:ascii="Calibri" w:cs="Calibri" w:eastAsia="Calibri" w:hAnsi="Calibri"/>
+          <w:rFonts w:ascii="Verdana" w:hAnsi="Verdana" w:eastAsia="Verdana" w:cs="Verdana"/>
+          <w:sz w:val="22"/>
+          <w:rtl w:val="0"/>
+        </w:rPr>
+      </w:r>
+    </w:p>
+    <w:p>
+      <w:pPr>
+        <w:spacing w:line="276" w:lineRule="auto"/>
+        <w:rPr>
+          <w:rFonts w:ascii="Calibri" w:cs="Calibri" w:eastAsia="Calibri" w:hAnsi="Calibri"/>
+        </w:rPr>
+      </w:pPr>
+      <w:r>
+        <w:rPr>
+          <w:rFonts w:ascii="Verdana" w:cs="Verdana" w:eastAsia="Verdana" w:hAnsi="Verdana"/>
+          <w:sz w:val="22"/>
           <w:rtl w:val="0"/>
         </w:rPr>
         <w:t xml:space="preserve">A description of this clinical trial will be available on http://www.ClinicalTrials.gov, as required by U.S. Law. This Web site will not include information that can identify you. At most, the Web site will include a summary of the results. You can search this Web site at any time.</w:t>
@@ -1366,6 +1549,8 @@
       </w:pPr>
       <w:r>
         <w:rPr>
+          <w:rFonts w:ascii="Verdana" w:hAnsi="Verdana" w:eastAsia="Verdana" w:cs="Verdana"/>
+          <w:sz w:val="22"/>
           <w:rtl w:val="0"/>
         </w:rPr>
       </w:r>
@@ -1373,48 +1558,110 @@
     <w:p>
       <w:pPr>
         <w:keepNext w:val="1"/>
-        <w:rPr>
-          <w:rFonts w:ascii="Calibri" w:cs="Calibri" w:eastAsia="Calibri" w:hAnsi="Calibri"/>
-        </w:rPr>
-      </w:pPr>
-      <w:r>
+        <w:spacing w:line="276" w:lineRule="auto"/>
+        <w:rPr>
+          <w:rFonts w:ascii="Calibri" w:cs="Calibri" w:eastAsia="Calibri" w:hAnsi="Calibri"/>
+        </w:rPr>
+      </w:pPr>
+      <w:r>
+        <w:rPr>
+          <w:rFonts w:ascii="Verdana" w:cs="Verdana" w:eastAsia="Verdana" w:hAnsi="Verdana"/>
+          <w:b w:val="1"/>
+          <w:bCs w:val="1"/>
+          <w:sz w:val="22"/>
+          <w:u w:val="single"/>
+          <w:rtl w:val="0"/>
+        </w:rPr>
+        <w:t xml:space="preserve">IN CASE OF AN INJURY RELATED TO THIS RESEARCH STUDY</w:t>
+      </w:r>
+      <w:r>
+        <w:rPr>
+          <w:rFonts w:ascii="Verdana" w:hAnsi="Verdana" w:eastAsia="Verdana" w:cs="Verdana"/>
+          <w:sz w:val="22"/>
+          <w:rtl w:val="0"/>
+        </w:rPr>
+      </w:r>
+    </w:p>
+    <w:p>
+      <w:pPr>
+        <w:spacing w:line="276" w:lineRule="auto"/>
+        <w:rPr>
+          <w:rFonts w:ascii="Calibri" w:cs="Calibri" w:eastAsia="Calibri" w:hAnsi="Calibri"/>
+        </w:rPr>
+      </w:pPr>
+      <w:r>
+        <w:rPr>
+          <w:rFonts w:ascii="Verdana" w:cs="Verdana" w:eastAsia="Verdana" w:hAnsi="Verdana"/>
+          <w:sz w:val="22"/>
+          <w:rtl w:val="0"/>
+        </w:rPr>
+        <w:t xml:space="preserve">Every effort to prevent study-related injury will be taken by the study doctor and study staff. In the event you are injured as a direct result of the study while following the study doctor’s instructions and the study requirements, you should immediately contact your study doctor.  The study doctor will treat you as needed for those injuries caused directly by this research study. In the event of injury or illness caused by or occurring during your participation in this research study, all charges for medical care provided to you will be billed to your insurance company. The study doctor or Sponsor does not offer to cover the medical care costs for injuries or illnesses that are not caused directly by the research study. The Sponsor does not offer any other compensation, unless specifically agreed to elsewhere in this document. Please be aware that some insurance plans may not pay for research-related injuries. You should contact your insurance company for more information.</w:t>
+      </w:r>
+    </w:p>
+    <w:p>
+      <w:pPr>
+        <w:rPr>
+          <w:rFonts w:ascii="Calibri" w:cs="Calibri" w:eastAsia="Calibri" w:hAnsi="Calibri"/>
+        </w:rPr>
+      </w:pPr>
+      <w:r>
+        <w:rPr>
+          <w:rFonts w:ascii="Verdana" w:hAnsi="Verdana" w:eastAsia="Verdana" w:cs="Verdana"/>
+          <w:sz w:val="22"/>
+          <w:rtl w:val="0"/>
+        </w:rPr>
+      </w:r>
+    </w:p>
+    <w:p>
+      <w:pPr>
+        <w:keepNext w:val="1"/>
+        <w:spacing w:line="276" w:lineRule="auto"/>
+        <w:ind w:right="7513"/>
         <w:rPr>
           <w:rFonts w:ascii="Calibri" w:cs="Calibri" w:eastAsia="Calibri" w:hAnsi="Calibri"/>
           <w:b w:val="1"/>
           <w:bCs w:val="1"/>
           <w:u w:val="single"/>
-          <w:rtl w:val="0"/>
-        </w:rPr>
-        <w:t xml:space="preserve">IN CASE OF AN INJURY RELATED TO THIS RESEARCH STUDY</w:t>
-      </w:r>
-      <w:r>
-        <w:rPr>
-          <w:rtl w:val="0"/>
-        </w:rPr>
-      </w:r>
-    </w:p>
-    <w:p>
-      <w:pPr>
-        <w:rPr>
-          <w:rFonts w:ascii="Calibri" w:cs="Calibri" w:eastAsia="Calibri" w:hAnsi="Calibri"/>
-        </w:rPr>
-      </w:pPr>
-      <w:r>
-        <w:rPr>
-          <w:rFonts w:ascii="Calibri" w:cs="Calibri" w:eastAsia="Calibri" w:hAnsi="Calibri"/>
-          <w:rtl w:val="0"/>
-        </w:rPr>
-        <w:t xml:space="preserve">Every effort to prevent study-related injury will be taken by the study doctor and study staff. In the event you are injured as a direct result of the study while following the study doctor’s instructions and the study requirements, you should immediately contact your study doctor.  The study doctor will treat you as needed for those injuries caused directly by this research study. In the event of injury or illness caused by or occurring during your participation in this research study, all charges for medical care provided to you will be billed to your insurance company. The study doctor or Sponsor does not offer to cover the medical care costs for injuries or illnesses that are not caused directly by the research study. The Sponsor does not offer any other compensation, unless specifically agreed to elsewhere in this document. Please be aware that some insurance plans may not pay for research-related injuries. You should contact your insurance company for more information.</w:t>
-      </w:r>
-    </w:p>
-    <w:p>
-      <w:pPr>
-        <w:rPr>
-          <w:rFonts w:ascii="Calibri" w:cs="Calibri" w:eastAsia="Calibri" w:hAnsi="Calibri"/>
-        </w:rPr>
-      </w:pPr>
-      <w:r>
-        <w:rPr>
+        </w:rPr>
+      </w:pPr>
+      <w:r>
+        <w:rPr>
+          <w:rFonts w:ascii="Verdana" w:cs="Verdana" w:eastAsia="Verdana" w:hAnsi="Verdana"/>
+          <w:b w:val="1"/>
+          <w:bCs w:val="1"/>
+          <w:sz w:val="22"/>
+          <w:u w:val="single"/>
+          <w:rtl w:val="0"/>
+        </w:rPr>
+        <w:t xml:space="preserve">LEGAL RIGHTS</w:t>
+      </w:r>
+    </w:p>
+    <w:p>
+      <w:pPr>
+        <w:spacing w:line="276" w:lineRule="auto"/>
+        <w:rPr>
+          <w:rFonts w:ascii="Calibri" w:cs="Calibri" w:eastAsia="Calibri" w:hAnsi="Calibri"/>
+        </w:rPr>
+      </w:pPr>
+      <w:r>
+        <w:rPr>
+          <w:rFonts w:ascii="Verdana" w:cs="Verdana" w:eastAsia="Verdana" w:hAnsi="Verdana"/>
+          <w:sz w:val="22"/>
+          <w:rtl w:val="0"/>
+        </w:rPr>
+        <w:t xml:space="preserve">You do not lose any legal rights by signing and dating this consent document. The above statement, “In Case of an Injury Related to This Research Study,” does not stop you from seeking legal help in case of negligence.</w:t>
+      </w:r>
+    </w:p>
+    <w:p>
+      <w:pPr>
+        <w:rPr>
+          <w:rFonts w:ascii="Calibri" w:cs="Calibri" w:eastAsia="Calibri" w:hAnsi="Calibri"/>
+        </w:rPr>
+      </w:pPr>
+      <w:r>
+        <w:rPr>
+          <w:rFonts w:ascii="Verdana" w:hAnsi="Verdana" w:eastAsia="Verdana" w:cs="Verdana"/>
+          <w:sz w:val="22"/>
           <w:rtl w:val="0"/>
         </w:rPr>
       </w:r>
@@ -1422,7 +1669,64 @@
     <w:p>
       <w:pPr>
         <w:keepNext w:val="1"/>
-        <w:ind w:right="7513"/>
+        <w:spacing w:line="276" w:lineRule="auto"/>
+        <w:rPr>
+          <w:rFonts w:ascii="Calibri" w:cs="Calibri" w:eastAsia="Calibri" w:hAnsi="Calibri"/>
+        </w:rPr>
+      </w:pPr>
+      <w:r>
+        <w:rPr>
+          <w:rFonts w:ascii="Verdana" w:cs="Verdana" w:eastAsia="Verdana" w:hAnsi="Verdana"/>
+          <w:b w:val="1"/>
+          <w:bCs w:val="1"/>
+          <w:sz w:val="22"/>
+          <w:u w:val="single"/>
+          <w:rtl w:val="0"/>
+        </w:rPr>
+        <w:t xml:space="preserve">NEW FINDINGS</w:t>
+      </w:r>
+      <w:r>
+        <w:rPr>
+          <w:rFonts w:ascii="Verdana" w:hAnsi="Verdana" w:eastAsia="Verdana" w:cs="Verdana"/>
+          <w:sz w:val="22"/>
+          <w:rtl w:val="0"/>
+        </w:rPr>
+      </w:r>
+    </w:p>
+    <w:p>
+      <w:pPr>
+        <w:spacing w:line="276" w:lineRule="auto"/>
+        <w:rPr>
+          <w:rFonts w:ascii="Calibri" w:cs="Calibri" w:eastAsia="Calibri" w:hAnsi="Calibri"/>
+        </w:rPr>
+      </w:pPr>
+      <w:r>
+        <w:rPr>
+          <w:rFonts w:ascii="Verdana" w:cs="Verdana" w:eastAsia="Verdana" w:hAnsi="Verdana"/>
+          <w:sz w:val="22"/>
+          <w:rtl w:val="0"/>
+        </w:rPr>
+        <w:t xml:space="preserve">During the study, you will be told of any important new findings about the study in a timely manner.  You can use this information to decide if you want to continue your participation in the study.</w:t>
+      </w:r>
+    </w:p>
+    <w:p>
+      <w:pPr>
+        <w:rPr>
+          <w:rFonts w:ascii="Calibri" w:cs="Calibri" w:eastAsia="Calibri" w:hAnsi="Calibri"/>
+        </w:rPr>
+      </w:pPr>
+      <w:r>
+        <w:rPr>
+          <w:rFonts w:ascii="Verdana" w:hAnsi="Verdana" w:eastAsia="Verdana" w:cs="Verdana"/>
+          <w:sz w:val="22"/>
+          <w:rtl w:val="0"/>
+        </w:rPr>
+      </w:r>
+    </w:p>
+    <w:p>
+      <w:pPr>
+        <w:keepNext w:val="1"/>
+        <w:spacing w:line="276" w:lineRule="auto"/>
         <w:rPr>
           <w:rFonts w:ascii="Calibri" w:cs="Calibri" w:eastAsia="Calibri" w:hAnsi="Calibri"/>
           <w:b w:val="1"/>
@@ -1432,121 +1736,28 @@
       </w:pPr>
       <w:r>
         <w:rPr>
-          <w:rFonts w:ascii="Calibri" w:cs="Calibri" w:eastAsia="Calibri" w:hAnsi="Calibri"/>
+          <w:rFonts w:ascii="Verdana" w:cs="Verdana" w:eastAsia="Verdana" w:hAnsi="Verdana"/>
           <w:b w:val="1"/>
           <w:bCs w:val="1"/>
+          <w:sz w:val="22"/>
           <w:u w:val="single"/>
           <w:rtl w:val="0"/>
         </w:rPr>
-        <w:t xml:space="preserve">LEGAL RIGHTS</w:t>
-      </w:r>
-    </w:p>
-    <w:p>
-      <w:pPr>
-        <w:rPr>
-          <w:rFonts w:ascii="Calibri" w:cs="Calibri" w:eastAsia="Calibri" w:hAnsi="Calibri"/>
-        </w:rPr>
-      </w:pPr>
-      <w:r>
-        <w:rPr>
-          <w:rFonts w:ascii="Calibri" w:cs="Calibri" w:eastAsia="Calibri" w:hAnsi="Calibri"/>
-          <w:rtl w:val="0"/>
-        </w:rPr>
-        <w:t xml:space="preserve">You do not lose any legal rights by signing and dating this consent document. The above statement, “In Case of an Injury Related to This Research Study,” does not stop you from seeking legal help in case of negligence.</w:t>
-      </w:r>
-    </w:p>
-    <w:p>
-      <w:pPr>
-        <w:rPr>
-          <w:rFonts w:ascii="Calibri" w:cs="Calibri" w:eastAsia="Calibri" w:hAnsi="Calibri"/>
-        </w:rPr>
-      </w:pPr>
-      <w:r>
-        <w:rPr>
-          <w:rtl w:val="0"/>
-        </w:rPr>
+        <w:t xml:space="preserve">WHOM TO CONTACT ABOUT THIS STUDY</w:t>
       </w:r>
     </w:p>
     <w:p>
       <w:pPr>
         <w:keepNext w:val="1"/>
-        <w:rPr>
-          <w:rFonts w:ascii="Calibri" w:cs="Calibri" w:eastAsia="Calibri" w:hAnsi="Calibri"/>
-        </w:rPr>
-      </w:pPr>
-      <w:r>
-        <w:rPr>
-          <w:rFonts w:ascii="Calibri" w:cs="Calibri" w:eastAsia="Calibri" w:hAnsi="Calibri"/>
-          <w:b w:val="1"/>
-          <w:bCs w:val="1"/>
-          <w:u w:val="single"/>
-          <w:rtl w:val="0"/>
-        </w:rPr>
-        <w:t xml:space="preserve">NEW FINDINGS</w:t>
-      </w:r>
-      <w:r>
-        <w:rPr>
-          <w:rtl w:val="0"/>
-        </w:rPr>
-      </w:r>
-    </w:p>
-    <w:p>
-      <w:pPr>
-        <w:rPr>
-          <w:rFonts w:ascii="Calibri" w:cs="Calibri" w:eastAsia="Calibri" w:hAnsi="Calibri"/>
-        </w:rPr>
-      </w:pPr>
-      <w:r>
-        <w:rPr>
-          <w:rFonts w:ascii="Calibri" w:cs="Calibri" w:eastAsia="Calibri" w:hAnsi="Calibri"/>
-          <w:rtl w:val="0"/>
-        </w:rPr>
-        <w:t xml:space="preserve">During the study, you will be told of any important new findings about the study in a timely manner.  You can use this information to decide if you want to continue your participation in the study.</w:t>
-      </w:r>
-    </w:p>
-    <w:p>
-      <w:pPr>
-        <w:rPr>
-          <w:rFonts w:ascii="Calibri" w:cs="Calibri" w:eastAsia="Calibri" w:hAnsi="Calibri"/>
-        </w:rPr>
-      </w:pPr>
-      <w:r>
-        <w:rPr>
-          <w:rtl w:val="0"/>
-        </w:rPr>
-      </w:r>
-    </w:p>
-    <w:p>
-      <w:pPr>
-        <w:keepNext w:val="1"/>
-        <w:rPr>
-          <w:rFonts w:ascii="Calibri" w:cs="Calibri" w:eastAsia="Calibri" w:hAnsi="Calibri"/>
-          <w:b w:val="1"/>
-          <w:bCs w:val="1"/>
-          <w:u w:val="single"/>
-        </w:rPr>
-      </w:pPr>
-      <w:r>
-        <w:rPr>
-          <w:rFonts w:ascii="Calibri" w:cs="Calibri" w:eastAsia="Calibri" w:hAnsi="Calibri"/>
-          <w:b w:val="1"/>
-          <w:bCs w:val="1"/>
-          <w:u w:val="single"/>
-          <w:rtl w:val="0"/>
-        </w:rPr>
-        <w:t xml:space="preserve">WHOM TO CONTACT ABOUT THIS STUDY</w:t>
-      </w:r>
-    </w:p>
-    <w:p>
-      <w:pPr>
-        <w:keepNext w:val="1"/>
-        <w:rPr>
-          <w:rFonts w:ascii="Calibri" w:cs="Calibri" w:eastAsia="Calibri" w:hAnsi="Calibri"/>
-        </w:rPr>
-      </w:pPr>
-      <w:r>
-        <w:rPr>
-          <w:rFonts w:ascii="Calibri" w:cs="Calibri" w:eastAsia="Calibri" w:hAnsi="Calibri"/>
+        <w:spacing w:line="276" w:lineRule="auto"/>
+        <w:rPr>
+          <w:rFonts w:ascii="Calibri" w:cs="Calibri" w:eastAsia="Calibri" w:hAnsi="Calibri"/>
+        </w:rPr>
+      </w:pPr>
+      <w:r>
+        <w:rPr>
+          <w:rFonts w:ascii="Verdana" w:cs="Verdana" w:eastAsia="Verdana" w:hAnsi="Verdana"/>
+          <w:sz w:val="22"/>
           <w:rtl w:val="0"/>
         </w:rPr>
         <w:t xml:space="preserve">During the study, if you experience any medical problems, suffer a research-related injury, or have questions, concerns or complaints about the study, such as:</w:t>
@@ -1558,7 +1769,7 @@
           <w:ilvl w:val="0"/>
           <w:numId w:val="5"/>
         </w:numPr>
-        <w:spacing w:line="259" w:lineRule="auto"/>
+        <w:spacing w:line="276" w:lineRule="auto"/>
         <w:ind w:left="720" w:hanging="360"/>
         <w:rPr>
           <w:rFonts w:ascii="Calibri" w:cs="Calibri" w:eastAsia="Calibri" w:hAnsi="Calibri"/>
@@ -1566,7 +1777,8 @@
       </w:pPr>
       <w:r>
         <w:rPr>
-          <w:rFonts w:ascii="Calibri" w:cs="Calibri" w:eastAsia="Calibri" w:hAnsi="Calibri"/>
+          <w:rFonts w:ascii="Verdana" w:cs="Verdana" w:eastAsia="Verdana" w:hAnsi="Verdana"/>
+          <w:sz w:val="22"/>
           <w:rtl w:val="0"/>
         </w:rPr>
         <w:t xml:space="preserve">Whom to contact in the case of a research-related injury or illness;</w:t>
@@ -1578,7 +1790,7 @@
           <w:ilvl w:val="0"/>
           <w:numId w:val="5"/>
         </w:numPr>
-        <w:spacing w:line="259" w:lineRule="auto"/>
+        <w:spacing w:line="276" w:lineRule="auto"/>
         <w:ind w:left="720" w:hanging="360"/>
         <w:rPr>
           <w:rFonts w:ascii="Calibri" w:cs="Calibri" w:eastAsia="Calibri" w:hAnsi="Calibri"/>
@@ -1586,7 +1798,8 @@
       </w:pPr>
       <w:r>
         <w:rPr>
-          <w:rFonts w:ascii="Calibri" w:cs="Calibri" w:eastAsia="Calibri" w:hAnsi="Calibri"/>
+          <w:rFonts w:ascii="Verdana" w:cs="Verdana" w:eastAsia="Verdana" w:hAnsi="Verdana"/>
+          <w:sz w:val="22"/>
           <w:rtl w:val="0"/>
         </w:rPr>
         <w:t xml:space="preserve">Payment or compensation for being in the study, if any;</w:t>
@@ -1598,7 +1811,7 @@
           <w:ilvl w:val="0"/>
           <w:numId w:val="5"/>
         </w:numPr>
-        <w:spacing w:line="259" w:lineRule="auto"/>
+        <w:spacing w:line="276" w:lineRule="auto"/>
         <w:ind w:left="720" w:hanging="360"/>
         <w:rPr>
           <w:rFonts w:ascii="Calibri" w:cs="Calibri" w:eastAsia="Calibri" w:hAnsi="Calibri"/>
@@ -1606,7 +1819,8 @@
       </w:pPr>
       <w:r>
         <w:rPr>
-          <w:rFonts w:ascii="Calibri" w:cs="Calibri" w:eastAsia="Calibri" w:hAnsi="Calibri"/>
+          <w:rFonts w:ascii="Verdana" w:cs="Verdana" w:eastAsia="Verdana" w:hAnsi="Verdana"/>
+          <w:sz w:val="22"/>
           <w:rtl w:val="0"/>
         </w:rPr>
         <w:t xml:space="preserve">Your responsibilities as a research participant;</w:t>
@@ -1618,7 +1832,7 @@
           <w:ilvl w:val="0"/>
           <w:numId w:val="5"/>
         </w:numPr>
-        <w:spacing w:line="259" w:lineRule="auto"/>
+        <w:spacing w:line="276" w:lineRule="auto"/>
         <w:ind w:left="720" w:hanging="360"/>
         <w:rPr>
           <w:rFonts w:ascii="Calibri" w:cs="Calibri" w:eastAsia="Calibri" w:hAnsi="Calibri"/>
@@ -1626,7 +1840,8 @@
       </w:pPr>
       <w:r>
         <w:rPr>
-          <w:rFonts w:ascii="Calibri" w:cs="Calibri" w:eastAsia="Calibri" w:hAnsi="Calibri"/>
+          <w:rFonts w:ascii="Verdana" w:cs="Verdana" w:eastAsia="Verdana" w:hAnsi="Verdana"/>
+          <w:sz w:val="22"/>
           <w:rtl w:val="0"/>
         </w:rPr>
         <w:t xml:space="preserve">Eligibility to participate in the study;</w:t>
@@ -1638,7 +1853,7 @@
           <w:ilvl w:val="0"/>
           <w:numId w:val="5"/>
         </w:numPr>
-        <w:spacing w:line="259" w:lineRule="auto"/>
+        <w:spacing w:line="276" w:lineRule="auto"/>
         <w:ind w:left="720" w:hanging="360"/>
         <w:rPr>
           <w:rFonts w:ascii="Calibri" w:cs="Calibri" w:eastAsia="Calibri" w:hAnsi="Calibri"/>
@@ -1646,7 +1861,8 @@
       </w:pPr>
       <w:r>
         <w:rPr>
-          <w:rFonts w:ascii="Calibri" w:cs="Calibri" w:eastAsia="Calibri" w:hAnsi="Calibri"/>
+          <w:rFonts w:ascii="Verdana" w:cs="Verdana" w:eastAsia="Verdana" w:hAnsi="Verdana"/>
+          <w:sz w:val="22"/>
           <w:rtl w:val="0"/>
         </w:rPr>
         <w:t xml:space="preserve">The study doctor’s or study site’s decision to withdraw you from participation;</w:t>
@@ -1658,7 +1874,7 @@
           <w:ilvl w:val="0"/>
           <w:numId w:val="5"/>
         </w:numPr>
-        <w:spacing w:line="259" w:lineRule="auto"/>
+        <w:spacing w:line="276" w:lineRule="auto"/>
         <w:ind w:left="720" w:hanging="360"/>
         <w:rPr>
           <w:rFonts w:ascii="Calibri" w:cs="Calibri" w:eastAsia="Calibri" w:hAnsi="Calibri"/>
@@ -1666,31 +1882,37 @@
       </w:pPr>
       <w:r>
         <w:rPr>
-          <w:rFonts w:ascii="Calibri" w:cs="Calibri" w:eastAsia="Calibri" w:hAnsi="Calibri"/>
+          <w:rFonts w:ascii="Verdana" w:cs="Verdana" w:eastAsia="Verdana" w:hAnsi="Verdana"/>
+          <w:sz w:val="22"/>
           <w:rtl w:val="0"/>
         </w:rPr>
         <w:t xml:space="preserve">Results of tests and/or procedures;</w:t>
       </w:r>
       <w:r>
         <w:rPr>
-          <w:rtl w:val="0"/>
-        </w:rPr>
-      </w:r>
-    </w:p>
-    <w:p>
-      <w:pPr>
-        <w:rPr>
-          <w:rFonts w:ascii="Calibri" w:cs="Calibri" w:eastAsia="Calibri" w:hAnsi="Calibri"/>
-        </w:rPr>
-      </w:pPr>
-      <w:r>
-        <w:rPr>
-          <w:rtl w:val="0"/>
-        </w:rPr>
-      </w:r>
-    </w:p>
-    <w:p>
-      <w:pPr>
+          <w:rFonts w:ascii="Verdana" w:hAnsi="Verdana" w:eastAsia="Verdana" w:cs="Verdana"/>
+          <w:sz w:val="22"/>
+          <w:rtl w:val="0"/>
+        </w:rPr>
+      </w:r>
+    </w:p>
+    <w:p>
+      <w:pPr>
+        <w:rPr>
+          <w:rFonts w:ascii="Calibri" w:cs="Calibri" w:eastAsia="Calibri" w:hAnsi="Calibri"/>
+        </w:rPr>
+      </w:pPr>
+      <w:r>
+        <w:rPr>
+          <w:rFonts w:ascii="Verdana" w:hAnsi="Verdana" w:eastAsia="Verdana" w:cs="Verdana"/>
+          <w:sz w:val="22"/>
+          <w:rtl w:val="0"/>
+        </w:rPr>
+      </w:r>
+    </w:p>
+    <w:p>
+      <w:pPr>
+        <w:spacing w:line="276" w:lineRule="auto"/>
         <w:rPr>
           <w:rFonts w:ascii="Calibri" w:cs="Calibri" w:eastAsia="Calibri" w:hAnsi="Calibri"/>
           <w:b w:val="1"/>
@@ -1700,9 +1922,10 @@
       </w:pPr>
       <w:r>
         <w:rPr>
-          <w:rFonts w:ascii="Calibri" w:cs="Calibri" w:eastAsia="Calibri" w:hAnsi="Calibri"/>
+          <w:rFonts w:ascii="Verdana" w:cs="Verdana" w:eastAsia="Verdana" w:hAnsi="Verdana"/>
           <w:b w:val="1"/>
           <w:bCs w:val="1"/>
+          <w:sz w:val="22"/>
           <w:u w:val="single"/>
           <w:rtl w:val="0"/>
         </w:rPr>
@@ -1717,19 +1940,23 @@
       </w:pPr>
       <w:r>
         <w:rPr>
-          <w:rtl w:val="0"/>
-        </w:rPr>
-      </w:r>
-    </w:p>
-    <w:p>
-      <w:pPr>
-        <w:rPr>
-          <w:rFonts w:ascii="Calibri" w:cs="Calibri" w:eastAsia="Calibri" w:hAnsi="Calibri"/>
-        </w:rPr>
-      </w:pPr>
-      <w:r>
-        <w:rPr>
-          <w:rFonts w:ascii="Calibri" w:cs="Calibri" w:eastAsia="Calibri" w:hAnsi="Calibri"/>
+          <w:rFonts w:ascii="Verdana" w:hAnsi="Verdana" w:eastAsia="Verdana" w:cs="Verdana"/>
+          <w:sz w:val="22"/>
+          <w:rtl w:val="0"/>
+        </w:rPr>
+      </w:r>
+    </w:p>
+    <w:p>
+      <w:pPr>
+        <w:spacing w:line="276" w:lineRule="auto"/>
+        <w:rPr>
+          <w:rFonts w:ascii="Calibri" w:cs="Calibri" w:eastAsia="Calibri" w:hAnsi="Calibri"/>
+        </w:rPr>
+      </w:pPr>
+      <w:r>
+        <w:rPr>
+          <w:rFonts w:ascii="Verdana" w:cs="Verdana" w:eastAsia="Verdana" w:hAnsi="Verdana"/>
+          <w:sz w:val="22"/>
           <w:rtl w:val="0"/>
         </w:rPr>
         <w:t xml:space="preserve">If you seek emergency care, or hospitalization is required, alert the treating physician that you are participating in this research study. </w:t>
@@ -1743,19 +1970,23 @@
       </w:pPr>
       <w:r>
         <w:rPr>
-          <w:rtl w:val="0"/>
-        </w:rPr>
-      </w:r>
-    </w:p>
-    <w:p>
-      <w:pPr>
-        <w:rPr>
-          <w:rFonts w:ascii="Calibri" w:cs="Calibri" w:eastAsia="Calibri" w:hAnsi="Calibri"/>
-        </w:rPr>
-      </w:pPr>
-      <w:r>
-        <w:rPr>
-          <w:rFonts w:ascii="Calibri" w:cs="Calibri" w:eastAsia="Calibri" w:hAnsi="Calibri"/>
+          <w:rFonts w:ascii="Verdana" w:hAnsi="Verdana" w:eastAsia="Verdana" w:cs="Verdana"/>
+          <w:sz w:val="22"/>
+          <w:rtl w:val="0"/>
+        </w:rPr>
+      </w:r>
+    </w:p>
+    <w:p>
+      <w:pPr>
+        <w:spacing w:line="276" w:lineRule="auto"/>
+        <w:rPr>
+          <w:rFonts w:ascii="Calibri" w:cs="Calibri" w:eastAsia="Calibri" w:hAnsi="Calibri"/>
+        </w:rPr>
+      </w:pPr>
+      <w:r>
+        <w:rPr>
+          <w:rFonts w:ascii="Verdana" w:cs="Verdana" w:eastAsia="Verdana" w:hAnsi="Verdana"/>
+          <w:sz w:val="22"/>
           <w:rtl w:val="0"/>
         </w:rPr>
         <w:t xml:space="preserve">An institutional review board (IRB) is an independent committee established to help protect the rights of research participants. If you have any questions about your rights as a research participant, contact:</w:t>
@@ -1769,6 +2000,8 @@
       </w:pPr>
       <w:r>
         <w:rPr>
+          <w:rFonts w:ascii="Verdana" w:hAnsi="Verdana" w:eastAsia="Verdana" w:cs="Verdana"/>
+          <w:sz w:val="22"/>
           <w:rtl w:val="0"/>
         </w:rPr>
       </w:r>
@@ -1780,6 +2013,7 @@
           <w:ilvl w:val="0"/>
           <w:numId w:val="4"/>
         </w:numPr>
+        <w:spacing w:line="276" w:lineRule="auto"/>
         <w:ind w:left="720" w:hanging="360"/>
         <w:rPr>
           <w:rFonts w:ascii="Calibri" w:cs="Calibri" w:eastAsia="Calibri" w:hAnsi="Calibri"/>
@@ -1789,16 +2023,18 @@
       <w:bookmarkEnd w:id="1"/>
       <w:r>
         <w:rPr>
-          <w:rFonts w:ascii="Calibri" w:cs="Calibri" w:eastAsia="Calibri" w:hAnsi="Calibri"/>
+          <w:rFonts w:ascii="Verdana" w:cs="Verdana" w:eastAsia="Verdana" w:hAnsi="Verdana"/>
+          <w:sz w:val="22"/>
           <w:rtl w:val="0"/>
         </w:rPr>
         <w:t xml:space="preserve">By </w:t>
       </w:r>
       <w:r>
         <w:rPr>
-          <w:rFonts w:ascii="Calibri" w:cs="Calibri" w:eastAsia="Calibri" w:hAnsi="Calibri"/>
+          <w:rFonts w:ascii="Verdana" w:cs="Verdana" w:eastAsia="Verdana" w:hAnsi="Verdana"/>
           <w:b w:val="1"/>
           <w:bCs w:val="1"/>
+          <w:sz w:val="22"/>
           <w:u w:val="single"/>
           <w:rtl w:val="0"/>
         </w:rPr>
@@ -1806,7 +2042,8 @@
       </w:r>
       <w:r>
         <w:rPr>
-          <w:rFonts w:ascii="Calibri" w:cs="Calibri" w:eastAsia="Calibri" w:hAnsi="Calibri"/>
+          <w:rFonts w:ascii="Verdana" w:cs="Verdana" w:eastAsia="Verdana" w:hAnsi="Verdana"/>
+          <w:sz w:val="22"/>
           <w:rtl w:val="0"/>
         </w:rPr>
         <w:t xml:space="preserve"> {irbAdress}</w:t>
@@ -1819,6 +2056,7 @@
           <w:ilvl w:val="0"/>
           <w:numId w:val="4"/>
         </w:numPr>
+        <w:spacing w:line="276" w:lineRule="auto"/>
         <w:ind w:left="720" w:hanging="360"/>
         <w:rPr>
           <w:rFonts w:ascii="Calibri" w:cs="Calibri" w:eastAsia="Calibri" w:hAnsi="Calibri"/>
@@ -1826,16 +2064,18 @@
       </w:pPr>
       <w:r>
         <w:rPr>
-          <w:rFonts w:ascii="Calibri" w:cs="Calibri" w:eastAsia="Calibri" w:hAnsi="Calibri"/>
+          <w:rFonts w:ascii="Verdana" w:cs="Verdana" w:eastAsia="Verdana" w:hAnsi="Verdana"/>
+          <w:sz w:val="22"/>
           <w:rtl w:val="0"/>
         </w:rPr>
         <w:t xml:space="preserve">or call </w:t>
       </w:r>
       <w:r>
         <w:rPr>
-          <w:rFonts w:ascii="Calibri" w:cs="Calibri" w:eastAsia="Calibri" w:hAnsi="Calibri"/>
+          <w:rFonts w:ascii="Verdana" w:cs="Verdana" w:eastAsia="Verdana" w:hAnsi="Verdana"/>
           <w:b w:val="1"/>
           <w:bCs w:val="1"/>
+          <w:sz w:val="22"/>
           <w:u w:val="single"/>
           <w:rtl w:val="0"/>
         </w:rPr>
@@ -1843,7 +2083,8 @@
       </w:r>
       <w:r>
         <w:rPr>
-          <w:rFonts w:ascii="Calibri" w:cs="Calibri" w:eastAsia="Calibri" w:hAnsi="Calibri"/>
+          <w:rFonts w:ascii="Verdana" w:cs="Verdana" w:eastAsia="Verdana" w:hAnsi="Verdana"/>
+          <w:sz w:val="22"/>
           <w:rtl w:val="0"/>
         </w:rPr>
         <w:t xml:space="preserve">: {irbPhone} </w:t>
@@ -1856,6 +2097,7 @@
           <w:ilvl w:val="0"/>
           <w:numId w:val="4"/>
         </w:numPr>
+        <w:spacing w:line="276" w:lineRule="auto"/>
         <w:ind w:left="720" w:hanging="360"/>
         <w:rPr>
           <w:rFonts w:ascii="Calibri" w:cs="Calibri" w:eastAsia="Calibri" w:hAnsi="Calibri"/>
@@ -1863,105 +2105,120 @@
       </w:pPr>
       <w:r>
         <w:rPr>
-          <w:rFonts w:ascii="Calibri" w:cs="Calibri" w:eastAsia="Calibri" w:hAnsi="Calibri"/>
+          <w:rFonts w:ascii="Verdana" w:cs="Verdana" w:eastAsia="Verdana" w:hAnsi="Verdana"/>
+          <w:sz w:val="22"/>
           <w:rtl w:val="0"/>
         </w:rPr>
         <w:t xml:space="preserve">or by </w:t>
       </w:r>
       <w:r>
+        <w:rPr>
+          <w:rFonts w:ascii="Verdana" w:cs="Verdana" w:eastAsia="Verdana" w:hAnsi="Verdana"/>
+          <w:b w:val="1"/>
+          <w:bCs w:val="1"/>
+          <w:sz w:val="22"/>
+          <w:u w:val="single"/>
+          <w:rtl w:val="0"/>
+        </w:rPr>
+        <w:t xml:space="preserve">email</w:t>
+      </w:r>
+      <w:r>
+        <w:rPr>
+          <w:rFonts w:ascii="Verdana" w:cs="Verdana" w:eastAsia="Verdana" w:hAnsi="Verdana"/>
+          <w:sz w:val="22"/>
+          <w:rtl w:val="0"/>
+        </w:rPr>
+        <w:t xml:space="preserve">: {irbEmail}</w:t>
+      </w:r>
+    </w:p>
+    <w:p>
+      <w:pPr>
+        <w:rPr>
+          <w:rFonts w:ascii="Calibri" w:cs="Calibri" w:eastAsia="Calibri" w:hAnsi="Calibri"/>
+        </w:rPr>
+      </w:pPr>
+      <w:r>
+        <w:rPr>
+          <w:rFonts w:ascii="Verdana" w:hAnsi="Verdana" w:eastAsia="Verdana" w:cs="Verdana"/>
+          <w:sz w:val="22"/>
+          <w:rtl w:val="0"/>
+        </w:rPr>
+      </w:r>
+    </w:p>
+    <w:p>
+      <w:pPr>
+        <w:spacing w:line="276" w:lineRule="auto"/>
+        <w:rPr>
+          <w:rFonts w:ascii="Calibri" w:cs="Calibri" w:eastAsia="Calibri" w:hAnsi="Calibri"/>
+        </w:rPr>
+      </w:pPr>
+      <w:r>
+        <w:rPr>
+          <w:rFonts w:ascii="Verdana" w:cs="Verdana" w:eastAsia="Verdana" w:hAnsi="Verdana"/>
+          <w:sz w:val="22"/>
+          <w:rtl w:val="0"/>
+        </w:rPr>
+        <w:t xml:space="preserve">Please reference the following number when contacting the Study Subject Adviser: </w:t>
+      </w:r>
+      <w:r>
+        <w:rPr>
+          <w:rFonts w:ascii="Verdana" w:cs="Verdana" w:eastAsia="Verdana" w:hAnsi="Verdana"/>
+          <w:sz w:val="22"/>
+          <w:u w:val="single"/>
+          <w:rtl w:val="0"/>
+        </w:rPr>
+        <w:t xml:space="preserve">{protocolNumber}</w:t>
+      </w:r>
+      <w:r>
+        <w:rPr>
+          <w:rFonts w:ascii="Verdana" w:cs="Verdana" w:eastAsia="Verdana" w:hAnsi="Verdana"/>
+          <w:sz w:val="22"/>
+          <w:u w:val="single"/>
+          <w:rtl w:val="0"/>
+        </w:rPr>
+        <w:t xml:space="preserve">.</w:t>
+      </w:r>
+      <w:r>
+        <w:rPr>
+          <w:rFonts w:ascii="Verdana" w:hAnsi="Verdana" w:eastAsia="Verdana" w:cs="Verdana"/>
+          <w:sz w:val="22"/>
+          <w:rtl w:val="0"/>
+        </w:rPr>
+      </w:r>
+    </w:p>
+    <w:p>
+      <w:pPr>
+        <w:rPr>
+          <w:rFonts w:ascii="Calibri" w:cs="Calibri" w:eastAsia="Calibri" w:hAnsi="Calibri"/>
+        </w:rPr>
+      </w:pPr>
+      <w:r>
+        <w:rPr>
+          <w:rFonts w:ascii="Verdana" w:hAnsi="Verdana" w:eastAsia="Verdana" w:cs="Verdana"/>
+          <w:sz w:val="22"/>
+          <w:rtl w:val="0"/>
+        </w:rPr>
+      </w:r>
+    </w:p>
+    <w:p>
+      <w:pPr>
+        <w:keepNext w:val="1"/>
+        <w:spacing w:line="276" w:lineRule="auto"/>
+        <w:ind w:right="40"/>
         <w:rPr>
           <w:rFonts w:ascii="Calibri" w:cs="Calibri" w:eastAsia="Calibri" w:hAnsi="Calibri"/>
           <w:b w:val="1"/>
           <w:bCs w:val="1"/>
           <w:u w:val="single"/>
-          <w:rtl w:val="0"/>
-        </w:rPr>
-        <w:t xml:space="preserve">email</w:t>
-      </w:r>
-      <w:r>
-        <w:rPr>
-          <w:rFonts w:ascii="Calibri" w:cs="Calibri" w:eastAsia="Calibri" w:hAnsi="Calibri"/>
-          <w:rtl w:val="0"/>
-        </w:rPr>
-        <w:t xml:space="preserve">: {irbEmail}</w:t>
-      </w:r>
-    </w:p>
-    <w:p>
-      <w:pPr>
-        <w:rPr>
-          <w:rFonts w:ascii="Calibri" w:cs="Calibri" w:eastAsia="Calibri" w:hAnsi="Calibri"/>
-        </w:rPr>
-      </w:pPr>
-      <w:r>
-        <w:rPr>
-          <w:rtl w:val="0"/>
-        </w:rPr>
-      </w:r>
-    </w:p>
-    <w:p>
-      <w:pPr>
-        <w:rPr>
-          <w:rFonts w:ascii="Calibri" w:cs="Calibri" w:eastAsia="Calibri" w:hAnsi="Calibri"/>
-        </w:rPr>
-      </w:pPr>
-      <w:r>
-        <w:rPr>
-          <w:rFonts w:ascii="Calibri" w:cs="Calibri" w:eastAsia="Calibri" w:hAnsi="Calibri"/>
-          <w:rtl w:val="0"/>
-        </w:rPr>
-        <w:t xml:space="preserve">Please reference the following number when contacting the Study Subject Adviser: </w:t>
-      </w:r>
-      <w:r>
-        <w:rPr>
-          <w:rFonts w:ascii="Calibri" w:cs="Calibri" w:eastAsia="Calibri" w:hAnsi="Calibri"/>
-          <w:u w:val="single"/>
-          <w:rtl w:val="0"/>
-        </w:rPr>
-        <w:t xml:space="preserve">{protocolNumber}</w:t>
-      </w:r>
-      <w:r>
-        <w:rPr>
-          <w:rFonts w:ascii="Calibri" w:cs="Calibri" w:eastAsia="Calibri" w:hAnsi="Calibri"/>
-          <w:u w:val="single"/>
-          <w:rtl w:val="0"/>
-        </w:rPr>
-        <w:t xml:space="preserve">.</w:t>
-      </w:r>
-      <w:r>
-        <w:rPr>
-          <w:rtl w:val="0"/>
-        </w:rPr>
-      </w:r>
-    </w:p>
-    <w:p>
-      <w:pPr>
-        <w:rPr>
-          <w:rFonts w:ascii="Calibri" w:cs="Calibri" w:eastAsia="Calibri" w:hAnsi="Calibri"/>
-        </w:rPr>
-      </w:pPr>
-      <w:r>
-        <w:rPr>
-          <w:rtl w:val="0"/>
-        </w:rPr>
-      </w:r>
-    </w:p>
-    <w:p>
-      <w:pPr>
-        <w:keepNext w:val="1"/>
-        <w:ind w:right="40"/>
-        <w:rPr>
-          <w:rFonts w:ascii="Calibri" w:cs="Calibri" w:eastAsia="Calibri" w:hAnsi="Calibri"/>
+        </w:rPr>
+      </w:pPr>
+      <w:r>
+        <w:rPr>
+          <w:rFonts w:ascii="Verdana" w:cs="Verdana" w:eastAsia="Verdana" w:hAnsi="Verdana"/>
           <w:b w:val="1"/>
           <w:bCs w:val="1"/>
+          <w:sz w:val="22"/>
           <w:u w:val="single"/>
-        </w:rPr>
-      </w:pPr>
-      <w:r>
-        <w:rPr>
-          <w:rFonts w:ascii="Calibri" w:cs="Calibri" w:eastAsia="Calibri" w:hAnsi="Calibri"/>
-          <w:b w:val="1"/>
-          <w:bCs w:val="1"/>
-          <w:u w:val="single"/>
           <w:rtl w:val="0"/>
         </w:rPr>
         <w:t xml:space="preserve">LEAVING THE STUDY</w:t>
@@ -1969,13 +2226,15 @@
     </w:p>
     <w:p>
       <w:pPr>
-        <w:rPr>
-          <w:rFonts w:ascii="Calibri" w:cs="Calibri" w:eastAsia="Calibri" w:hAnsi="Calibri"/>
-        </w:rPr>
-      </w:pPr>
-      <w:r>
-        <w:rPr>
-          <w:rFonts w:ascii="Calibri" w:cs="Calibri" w:eastAsia="Calibri" w:hAnsi="Calibri"/>
+        <w:spacing w:line="276" w:lineRule="auto"/>
+        <w:rPr>
+          <w:rFonts w:ascii="Calibri" w:cs="Calibri" w:eastAsia="Calibri" w:hAnsi="Calibri"/>
+        </w:rPr>
+      </w:pPr>
+      <w:r>
+        <w:rPr>
+          <w:rFonts w:ascii="Verdana" w:cs="Verdana" w:eastAsia="Verdana" w:hAnsi="Verdana"/>
+          <w:sz w:val="22"/>
           <w:rtl w:val="0"/>
         </w:rPr>
         <w:t xml:space="preserve">Taking part in this study is your choice. You may choose either to take part or not to take part in the study. You have the right to leave this study at any time. If you do not want to be in the study or decide to leave the study at any time, there will be no penalty to you, and you will not lose any benefits to which you are otherwise entitled.</w:t>
@@ -1989,19 +2248,23 @@
       </w:pPr>
       <w:r>
         <w:rPr>
-          <w:rtl w:val="0"/>
-        </w:rPr>
-      </w:r>
-    </w:p>
-    <w:p>
-      <w:pPr>
-        <w:rPr>
-          <w:rFonts w:ascii="Calibri" w:cs="Calibri" w:eastAsia="Calibri" w:hAnsi="Calibri"/>
-        </w:rPr>
-      </w:pPr>
-      <w:r>
-        <w:rPr>
-          <w:rFonts w:ascii="Calibri" w:cs="Calibri" w:eastAsia="Calibri" w:hAnsi="Calibri"/>
+          <w:rFonts w:ascii="Verdana" w:hAnsi="Verdana" w:eastAsia="Verdana" w:cs="Verdana"/>
+          <w:sz w:val="22"/>
+          <w:rtl w:val="0"/>
+        </w:rPr>
+      </w:r>
+    </w:p>
+    <w:p>
+      <w:pPr>
+        <w:spacing w:line="276" w:lineRule="auto"/>
+        <w:rPr>
+          <w:rFonts w:ascii="Calibri" w:cs="Calibri" w:eastAsia="Calibri" w:hAnsi="Calibri"/>
+        </w:rPr>
+      </w:pPr>
+      <w:r>
+        <w:rPr>
+          <w:rFonts w:ascii="Verdana" w:cs="Verdana" w:eastAsia="Verdana" w:hAnsi="Verdana"/>
+          <w:sz w:val="22"/>
           <w:rtl w:val="0"/>
         </w:rPr>
         <w:t xml:space="preserve">If you wish to leave this study, please call the study doctor or study staff at the telephone number listed on the first page of this consent document to schedule study exit procedures.</w:t>
@@ -2015,6 +2278,8 @@
       </w:pPr>
       <w:r>
         <w:rPr>
+          <w:rFonts w:ascii="Verdana" w:hAnsi="Verdana" w:eastAsia="Verdana" w:cs="Verdana"/>
+          <w:sz w:val="22"/>
           <w:rtl w:val="0"/>
         </w:rPr>
       </w:r>
@@ -2022,13 +2287,15 @@
     <w:p>
       <w:pPr>
         <w:keepNext w:val="1"/>
-        <w:rPr>
-          <w:rFonts w:ascii="Calibri" w:cs="Calibri" w:eastAsia="Calibri" w:hAnsi="Calibri"/>
-        </w:rPr>
-      </w:pPr>
-      <w:r>
-        <w:rPr>
-          <w:rFonts w:ascii="Calibri" w:cs="Calibri" w:eastAsia="Calibri" w:hAnsi="Calibri"/>
+        <w:spacing w:line="276" w:lineRule="auto"/>
+        <w:rPr>
+          <w:rFonts w:ascii="Calibri" w:cs="Calibri" w:eastAsia="Calibri" w:hAnsi="Calibri"/>
+        </w:rPr>
+      </w:pPr>
+      <w:r>
+        <w:rPr>
+          <w:rFonts w:ascii="Verdana" w:cs="Verdana" w:eastAsia="Verdana" w:hAnsi="Verdana"/>
+          <w:sz w:val="22"/>
           <w:rtl w:val="0"/>
         </w:rPr>
         <w:t xml:space="preserve">Your part in this study may be stopped at any time without your permission. The following people can stop your participation and/or the study itself:</w:t>
@@ -2044,6 +2311,8 @@
       </w:pPr>
       <w:r>
         <w:rPr>
+          <w:rFonts w:ascii="Verdana" w:hAnsi="Verdana" w:eastAsia="Verdana" w:cs="Verdana"/>
+          <w:sz w:val="22"/>
           <w:rtl w:val="0"/>
         </w:rPr>
       </w:r>
@@ -2055,6 +2324,7 @@
           <w:ilvl w:val="0"/>
           <w:numId w:val="2"/>
         </w:numPr>
+        <w:spacing w:line="276" w:lineRule="auto"/>
         <w:ind w:left="720" w:right="27" w:hanging="360"/>
         <w:rPr>
           <w:rFonts w:ascii="Calibri" w:cs="Calibri" w:eastAsia="Calibri" w:hAnsi="Calibri"/>
@@ -2062,7 +2332,8 @@
       </w:pPr>
       <w:r>
         <w:rPr>
-          <w:rFonts w:ascii="Calibri" w:cs="Calibri" w:eastAsia="Calibri" w:hAnsi="Calibri"/>
+          <w:rFonts w:ascii="Verdana" w:cs="Verdana" w:eastAsia="Verdana" w:hAnsi="Verdana"/>
+          <w:sz w:val="22"/>
           <w:rtl w:val="0"/>
         </w:rPr>
         <w:t xml:space="preserve">Study Doctor</w:t>
@@ -2075,6 +2346,7 @@
           <w:ilvl w:val="0"/>
           <w:numId w:val="2"/>
         </w:numPr>
+        <w:spacing w:line="276" w:lineRule="auto"/>
         <w:ind w:left="720" w:right="27" w:hanging="360"/>
         <w:rPr>
           <w:rFonts w:ascii="Calibri" w:cs="Calibri" w:eastAsia="Calibri" w:hAnsi="Calibri"/>
@@ -2082,7 +2354,8 @@
       </w:pPr>
       <w:r>
         <w:rPr>
-          <w:rFonts w:ascii="Calibri" w:cs="Calibri" w:eastAsia="Calibri" w:hAnsi="Calibri"/>
+          <w:rFonts w:ascii="Verdana" w:cs="Verdana" w:eastAsia="Verdana" w:hAnsi="Verdana"/>
+          <w:sz w:val="22"/>
           <w:rtl w:val="0"/>
         </w:rPr>
         <w:t xml:space="preserve">Sponsor</w:t>
@@ -2095,6 +2368,7 @@
           <w:ilvl w:val="0"/>
           <w:numId w:val="2"/>
         </w:numPr>
+        <w:spacing w:line="276" w:lineRule="auto"/>
         <w:ind w:left="720" w:right="27" w:hanging="360"/>
         <w:rPr>
           <w:rFonts w:ascii="Calibri" w:cs="Calibri" w:eastAsia="Calibri" w:hAnsi="Calibri"/>
@@ -2102,7 +2376,8 @@
       </w:pPr>
       <w:r>
         <w:rPr>
-          <w:rFonts w:ascii="Calibri" w:cs="Calibri" w:eastAsia="Calibri" w:hAnsi="Calibri"/>
+          <w:rFonts w:ascii="Verdana" w:cs="Verdana" w:eastAsia="Verdana" w:hAnsi="Verdana"/>
+          <w:sz w:val="22"/>
           <w:rtl w:val="0"/>
         </w:rPr>
         <w:t xml:space="preserve">{irbName} IRB (an independent ethics committee that reviewed the ethical aspects of this study to help protect the rights and welfare of study participants)</w:t>
@@ -2114,6 +2389,7 @@
           <w:ilvl w:val="0"/>
           <w:numId w:val="2"/>
         </w:numPr>
+        <w:spacing w:line="276" w:lineRule="auto"/>
         <w:ind w:left="720" w:hanging="360"/>
         <w:rPr>
           <w:rFonts w:ascii="Calibri" w:cs="Calibri" w:eastAsia="Calibri" w:hAnsi="Calibri"/>
@@ -2121,7 +2397,8 @@
       </w:pPr>
       <w:r>
         <w:rPr>
-          <w:rFonts w:ascii="Calibri" w:cs="Calibri" w:eastAsia="Calibri" w:hAnsi="Calibri"/>
+          <w:rFonts w:ascii="Verdana" w:cs="Verdana" w:eastAsia="Verdana" w:hAnsi="Verdana"/>
+          <w:sz w:val="22"/>
           <w:rtl w:val="0"/>
         </w:rPr>
         <w:t xml:space="preserve">Government regulatory authorities including Health Canada, the US Food and Drug Administration (FDA) and other foreign regulatory agencies</w:t>
@@ -2135,19 +2412,23 @@
       </w:pPr>
       <w:r>
         <w:rPr>
-          <w:rtl w:val="0"/>
-        </w:rPr>
-      </w:r>
-    </w:p>
-    <w:p>
-      <w:pPr>
-        <w:rPr>
-          <w:rFonts w:ascii="Calibri" w:cs="Calibri" w:eastAsia="Calibri" w:hAnsi="Calibri"/>
-        </w:rPr>
-      </w:pPr>
-      <w:r>
-        <w:rPr>
-          <w:rFonts w:ascii="Calibri" w:cs="Calibri" w:eastAsia="Calibri" w:hAnsi="Calibri"/>
+          <w:rFonts w:ascii="Verdana" w:hAnsi="Verdana" w:eastAsia="Verdana" w:cs="Verdana"/>
+          <w:sz w:val="22"/>
+          <w:rtl w:val="0"/>
+        </w:rPr>
+      </w:r>
+    </w:p>
+    <w:p>
+      <w:pPr>
+        <w:spacing w:line="276" w:lineRule="auto"/>
+        <w:rPr>
+          <w:rFonts w:ascii="Calibri" w:cs="Calibri" w:eastAsia="Calibri" w:hAnsi="Calibri"/>
+        </w:rPr>
+      </w:pPr>
+      <w:r>
+        <w:rPr>
+          <w:rFonts w:ascii="Verdana" w:cs="Verdana" w:eastAsia="Verdana" w:hAnsi="Verdana"/>
+          <w:sz w:val="22"/>
           <w:rtl w:val="0"/>
         </w:rPr>
         <w:t xml:space="preserve">If you do not follow the study procedures, you may be taken out of the study.</w:t>
@@ -2161,19 +2442,23 @@
       </w:pPr>
       <w:r>
         <w:rPr>
-          <w:rtl w:val="0"/>
-        </w:rPr>
-      </w:r>
-    </w:p>
-    <w:p>
-      <w:pPr>
-        <w:rPr>
-          <w:rFonts w:ascii="Calibri" w:cs="Calibri" w:eastAsia="Calibri" w:hAnsi="Calibri"/>
-        </w:rPr>
-      </w:pPr>
-      <w:r>
-        <w:rPr>
-          <w:rFonts w:ascii="Calibri" w:cs="Calibri" w:eastAsia="Calibri" w:hAnsi="Calibri"/>
+          <w:rFonts w:ascii="Verdana" w:hAnsi="Verdana" w:eastAsia="Verdana" w:cs="Verdana"/>
+          <w:sz w:val="22"/>
+          <w:rtl w:val="0"/>
+        </w:rPr>
+      </w:r>
+    </w:p>
+    <w:p>
+      <w:pPr>
+        <w:spacing w:line="276" w:lineRule="auto"/>
+        <w:rPr>
+          <w:rFonts w:ascii="Calibri" w:cs="Calibri" w:eastAsia="Calibri" w:hAnsi="Calibri"/>
+        </w:rPr>
+      </w:pPr>
+      <w:r>
+        <w:rPr>
+          <w:rFonts w:ascii="Verdana" w:cs="Verdana" w:eastAsia="Verdana" w:hAnsi="Verdana"/>
+          <w:sz w:val="22"/>
           <w:rtl w:val="0"/>
         </w:rPr>
         <w:t xml:space="preserve">If you withdraw from the study, no new data about you will be collected for study purposes. The already collected data relating to you up to the time of your withdrawal will be used and analyzed.</w:t>
@@ -2190,6 +2475,8 @@
       </w:pPr>
       <w:r>
         <w:rPr>
+          <w:rFonts w:ascii="Verdana" w:hAnsi="Verdana" w:eastAsia="Verdana" w:cs="Verdana"/>
+          <w:sz w:val="22"/>
           <w:rtl w:val="0"/>
         </w:rPr>
       </w:r>
@@ -2197,21 +2484,25 @@
     <w:p>
       <w:pPr>
         <w:keepNext w:val="1"/>
-        <w:rPr>
-          <w:rFonts w:ascii="Calibri" w:cs="Calibri" w:eastAsia="Calibri" w:hAnsi="Calibri"/>
-        </w:rPr>
-      </w:pPr>
-      <w:r>
-        <w:rPr>
-          <w:rFonts w:ascii="Calibri" w:cs="Calibri" w:eastAsia="Calibri" w:hAnsi="Calibri"/>
+        <w:spacing w:line="276" w:lineRule="auto"/>
+        <w:rPr>
+          <w:rFonts w:ascii="Calibri" w:cs="Calibri" w:eastAsia="Calibri" w:hAnsi="Calibri"/>
+        </w:rPr>
+      </w:pPr>
+      <w:r>
+        <w:rPr>
+          <w:rFonts w:ascii="Verdana" w:cs="Verdana" w:eastAsia="Verdana" w:hAnsi="Verdana"/>
           <w:b w:val="1"/>
           <w:bCs w:val="1"/>
+          <w:sz w:val="22"/>
           <w:rtl w:val="0"/>
         </w:rPr>
         <w:t xml:space="preserve">Check your preference below indicating if you want your Study Doctor to release information regarding your participation in this research study to your primary care physician.</w:t>
       </w:r>
       <w:r>
         <w:rPr>
+          <w:rFonts w:ascii="Verdana" w:hAnsi="Verdana" w:eastAsia="Verdana" w:cs="Verdana"/>
+          <w:sz w:val="22"/>
           <w:rtl w:val="0"/>
         </w:rPr>
       </w:r>
@@ -2225,6 +2516,8 @@
       </w:pPr>
       <w:r>
         <w:rPr>
+          <w:rFonts w:ascii="Verdana" w:hAnsi="Verdana" w:eastAsia="Verdana" w:cs="Verdana"/>
+          <w:sz w:val="22"/>
           <w:rtl w:val="0"/>
         </w:rPr>
       </w:r>
@@ -2236,6 +2529,7 @@
           <w:ilvl w:val="0"/>
           <w:numId w:val="3"/>
         </w:numPr>
+        <w:spacing w:line="276" w:lineRule="auto"/>
         <w:ind w:left="720" w:hanging="360"/>
         <w:rPr>
           <w:rFonts w:ascii="Calibri" w:cs="Calibri" w:eastAsia="Calibri" w:hAnsi="Calibri"/>
@@ -2243,7 +2537,8 @@
       </w:pPr>
       <w:r>
         <w:rPr>
-          <w:rFonts w:ascii="Calibri" w:cs="Calibri" w:eastAsia="Calibri" w:hAnsi="Calibri"/>
+          <w:rFonts w:ascii="Verdana" w:cs="Verdana" w:eastAsia="Verdana" w:hAnsi="Verdana"/>
+          <w:sz w:val="22"/>
           <w:rtl w:val="0"/>
         </w:rPr>
         <w:t xml:space="preserve">Yes, inform my primary care physician at this time.</w:t>
@@ -2258,6 +2553,8 @@
       </w:pPr>
       <w:r>
         <w:rPr>
+          <w:rFonts w:ascii="Verdana" w:hAnsi="Verdana" w:eastAsia="Verdana" w:cs="Verdana"/>
+          <w:sz w:val="22"/>
           <w:rtl w:val="0"/>
         </w:rPr>
       </w:r>
@@ -2268,6 +2565,7 @@
           <w:ilvl w:val="0"/>
           <w:numId w:val="3"/>
         </w:numPr>
+        <w:spacing w:line="276" w:lineRule="auto"/>
         <w:ind w:left="720" w:hanging="360"/>
         <w:rPr>
           <w:rFonts w:ascii="Calibri" w:cs="Calibri" w:eastAsia="Calibri" w:hAnsi="Calibri"/>
@@ -2275,7 +2573,8 @@
       </w:pPr>
       <w:r>
         <w:rPr>
-          <w:rFonts w:ascii="Calibri" w:cs="Calibri" w:eastAsia="Calibri" w:hAnsi="Calibri"/>
+          <w:rFonts w:ascii="Verdana" w:cs="Verdana" w:eastAsia="Verdana" w:hAnsi="Verdana"/>
+          <w:sz w:val="22"/>
           <w:rtl w:val="0"/>
         </w:rPr>
         <w:t xml:space="preserve">No, do not inform my primary care physician at this time.</w:t>
@@ -2289,6 +2588,8 @@
       </w:pPr>
       <w:r>
         <w:rPr>
+          <w:rFonts w:ascii="Verdana" w:hAnsi="Verdana" w:eastAsia="Verdana" w:cs="Verdana"/>
+          <w:sz w:val="22"/>
           <w:rtl w:val="0"/>
         </w:rPr>
       </w:r>
@@ -2302,6 +2603,8 @@
       </w:pPr>
       <w:r>
         <w:rPr>
+          <w:rFonts w:ascii="Verdana" w:hAnsi="Verdana" w:eastAsia="Verdana" w:cs="Verdana"/>
+          <w:sz w:val="22"/>
           <w:rtl w:val="0"/>
         </w:rPr>
       </w:r>
@@ -2309,19 +2612,25 @@
     <w:p>
       <w:pPr>
         <w:keepNext w:val="1"/>
+        <w:spacing w:line="276" w:lineRule="auto"/>
         <w:ind w:right="58"/>
         <w:rPr>
           <w:rFonts w:ascii="Calibri" w:cs="Calibri" w:eastAsia="Calibri" w:hAnsi="Calibri"/>
         </w:rPr>
       </w:pPr>
       <w:r>
+        <w:rPr>
+          <w:rFonts w:ascii="Verdana" w:hAnsi="Verdana" w:eastAsia="Verdana" w:cs="Verdana"/>
+          <w:sz w:val="22"/>
+        </w:rPr>
         <w:br w:type="column"/>
       </w:r>
       <w:r>
         <w:rPr>
-          <w:rFonts w:ascii="Calibri" w:cs="Calibri" w:eastAsia="Calibri" w:hAnsi="Calibri"/>
+          <w:rFonts w:ascii="Verdana" w:cs="Verdana" w:eastAsia="Verdana" w:hAnsi="Verdana"/>
           <w:b w:val="1"/>
           <w:bCs w:val="1"/>
+          <w:sz w:val="22"/>
           <w:u w:val="single"/>
           <w:rtl w:val="0"/>
         </w:rPr>
@@ -2329,19 +2638,23 @@
       </w:r>
       <w:r>
         <w:rPr>
-          <w:rtl w:val="0"/>
-        </w:rPr>
-      </w:r>
-    </w:p>
-    <w:p>
-      <w:pPr>
-        <w:rPr>
-          <w:rFonts w:ascii="Calibri" w:cs="Calibri" w:eastAsia="Calibri" w:hAnsi="Calibri"/>
-        </w:rPr>
-      </w:pPr>
-      <w:r>
-        <w:rPr>
-          <w:rFonts w:ascii="Calibri" w:cs="Calibri" w:eastAsia="Calibri" w:hAnsi="Calibri"/>
+          <w:rFonts w:ascii="Verdana" w:hAnsi="Verdana" w:eastAsia="Verdana" w:cs="Verdana"/>
+          <w:sz w:val="22"/>
+          <w:rtl w:val="0"/>
+        </w:rPr>
+      </w:r>
+    </w:p>
+    <w:p>
+      <w:pPr>
+        <w:spacing w:line="276" w:lineRule="auto"/>
+        <w:rPr>
+          <w:rFonts w:ascii="Calibri" w:cs="Calibri" w:eastAsia="Calibri" w:hAnsi="Calibri"/>
+        </w:rPr>
+      </w:pPr>
+      <w:r>
+        <w:rPr>
+          <w:rFonts w:ascii="Verdana" w:cs="Verdana" w:eastAsia="Verdana" w:hAnsi="Verdana"/>
+          <w:sz w:val="22"/>
           <w:rtl w:val="0"/>
         </w:rPr>
         <w:t xml:space="preserve">This consent document contains important information to help you decide if you want to be in this study. If you have any questions that are not answered in this consent document, please ask the person explaining this document or one of the study staff.</w:t>
@@ -2355,19 +2668,23 @@
       </w:pPr>
       <w:r>
         <w:rPr>
-          <w:rtl w:val="0"/>
-        </w:rPr>
-      </w:r>
-    </w:p>
-    <w:p>
-      <w:pPr>
-        <w:rPr>
-          <w:rFonts w:ascii="Calibri" w:cs="Calibri" w:eastAsia="Calibri" w:hAnsi="Calibri"/>
-        </w:rPr>
-      </w:pPr>
-      <w:r>
-        <w:rPr>
-          <w:rFonts w:ascii="Calibri" w:cs="Calibri" w:eastAsia="Calibri" w:hAnsi="Calibri"/>
+          <w:rFonts w:ascii="Verdana" w:hAnsi="Verdana" w:eastAsia="Verdana" w:cs="Verdana"/>
+          <w:sz w:val="22"/>
+          <w:rtl w:val="0"/>
+        </w:rPr>
+      </w:r>
+    </w:p>
+    <w:p>
+      <w:pPr>
+        <w:spacing w:line="276" w:lineRule="auto"/>
+        <w:rPr>
+          <w:rFonts w:ascii="Calibri" w:cs="Calibri" w:eastAsia="Calibri" w:hAnsi="Calibri"/>
+        </w:rPr>
+      </w:pPr>
+      <w:r>
+        <w:rPr>
+          <w:rFonts w:ascii="Verdana" w:cs="Verdana" w:eastAsia="Verdana" w:hAnsi="Verdana"/>
+          <w:sz w:val="22"/>
           <w:rtl w:val="0"/>
         </w:rPr>
         <w:t xml:space="preserve">By signing and dating this consent document you confirm that you read all of the pages and understood the information in this informed consent. By consenting to participate you agree that you have been given a copy of all pages of this consent document. You have had an opportunity to ask questions and received satisfactory answers to all your questions about this study. You understand that you are free to leave the study at any time without having to give a reason and without affecting your medical care. You understand that your study-related medical records may be reviewed by the company sponsoring the study and by government authorities.</w:t>
@@ -2381,6 +2698,8 @@
       </w:pPr>
       <w:r>
         <w:rPr>
+          <w:rFonts w:ascii="Verdana" w:hAnsi="Verdana" w:eastAsia="Verdana" w:cs="Verdana"/>
+          <w:sz w:val="22"/>
           <w:rtl w:val="0"/>
         </w:rPr>
       </w:r>
@@ -2388,6 +2707,7 @@
     <w:p>
       <w:pPr>
         <w:keepNext w:val="1"/>
+        <w:spacing w:line="276" w:lineRule="auto"/>
         <w:ind w:right="419"/>
         <w:rPr>
           <w:rFonts w:ascii="Calibri" w:cs="Calibri" w:eastAsia="Calibri" w:hAnsi="Calibri"/>
@@ -2395,15 +2715,18 @@
       </w:pPr>
       <w:r>
         <w:rPr>
-          <w:rFonts w:ascii="Calibri" w:cs="Calibri" w:eastAsia="Calibri" w:hAnsi="Calibri"/>
+          <w:rFonts w:ascii="Verdana" w:cs="Verdana" w:eastAsia="Verdana" w:hAnsi="Verdana"/>
           <w:b w:val="1"/>
           <w:bCs w:val="1"/>
+          <w:sz w:val="22"/>
           <w:rtl w:val="0"/>
         </w:rPr>
         <w:t xml:space="preserve">IF YOU DO NOT AGREE WITH THE STATEMENT ABOVE, YOU SHOULD NOT SIGN THIS INFORMED CONSENT DOCUMENT.</w:t>
       </w:r>
       <w:r>
         <w:rPr>
+          <w:rFonts w:ascii="Verdana" w:hAnsi="Verdana" w:eastAsia="Verdana" w:cs="Verdana"/>
+          <w:sz w:val="22"/>
           <w:rtl w:val="0"/>
         </w:rPr>
       </w:r>
@@ -2417,19 +2740,22 @@
       </w:pPr>
       <w:r>
         <w:rPr>
-          <w:rtl w:val="0"/>
-        </w:rPr>
-      </w:r>
-    </w:p>
-    <w:p>
-      <w:pPr>
-        <w:rPr>
-          <w:rFonts w:ascii="Calibri" w:cs="Calibri" w:eastAsia="Calibri" w:hAnsi="Calibri"/>
-        </w:rPr>
-      </w:pPr>
-      <w:r>
-        <w:rPr>
-          <w:rFonts w:ascii="Calibri" w:cs="Calibri" w:eastAsia="Calibri" w:hAnsi="Calibri"/>
+          <w:rFonts w:ascii="Verdana" w:hAnsi="Verdana" w:eastAsia="Verdana" w:cs="Verdana"/>
+          <w:sz w:val="22"/>
+          <w:rtl w:val="0"/>
+        </w:rPr>
+      </w:r>
+    </w:p>
+    <w:p>
+      <w:pPr>
+        <w:rPr>
+          <w:rFonts w:ascii="Calibri" w:cs="Calibri" w:eastAsia="Calibri" w:hAnsi="Calibri"/>
+        </w:rPr>
+      </w:pPr>
+      <w:r>
+        <w:rPr>
+          <w:rFonts w:ascii="Verdana" w:cs="Verdana" w:eastAsia="Verdana" w:hAnsi="Verdana"/>
+          <w:sz w:val="22"/>
           <w:u w:val="single"/>
           <w:rtl w:val="0"/>
         </w:rPr>
@@ -2446,6 +2772,8 @@
       </w:r>
       <w:r>
         <w:rPr>
+          <w:rFonts w:ascii="Verdana" w:hAnsi="Verdana" w:eastAsia="Verdana" w:cs="Verdana"/>
+          <w:sz w:val="22"/>
           <w:rtl w:val="0"/>
         </w:rPr>
       </w:r>
@@ -2453,6 +2781,7 @@
     <w:p>
       <w:pPr>
         <w:keepNext w:val="1"/>
+        <w:spacing w:line="276" w:lineRule="auto"/>
         <w:ind w:right="-20"/>
         <w:rPr>
           <w:rFonts w:ascii="Calibri" w:cs="Calibri" w:eastAsia="Calibri" w:hAnsi="Calibri"/>
@@ -2460,7 +2789,8 @@
       </w:pPr>
       <w:r>
         <w:rPr>
-          <w:rFonts w:ascii="Calibri" w:cs="Calibri" w:eastAsia="Calibri" w:hAnsi="Calibri"/>
+          <w:rFonts w:ascii="Verdana" w:cs="Verdana" w:eastAsia="Verdana" w:hAnsi="Verdana"/>
+          <w:sz w:val="22"/>
           <w:rtl w:val="0"/>
         </w:rPr>
         <w:t xml:space="preserve">Printed Name of Participant</w:t>
@@ -2475,6 +2805,8 @@
       </w:pPr>
       <w:r>
         <w:rPr>
+          <w:rFonts w:ascii="Verdana" w:hAnsi="Verdana" w:eastAsia="Verdana" w:cs="Verdana"/>
+          <w:sz w:val="22"/>
           <w:rtl w:val="0"/>
         </w:rPr>
       </w:r>
@@ -2488,7 +2820,8 @@
       </w:pPr>
       <w:r>
         <w:rPr>
-          <w:rFonts w:ascii="Calibri" w:cs="Calibri" w:eastAsia="Calibri" w:hAnsi="Calibri"/>
+          <w:rFonts w:ascii="Verdana" w:cs="Verdana" w:eastAsia="Verdana" w:hAnsi="Verdana"/>
+          <w:sz w:val="22"/>
           <w:u w:val="single"/>
           <w:rtl w:val="0"/>
         </w:rPr>
@@ -2508,6 +2841,8 @@
       </w:r>
       <w:r>
         <w:rPr>
+          <w:rFonts w:ascii="Verdana" w:hAnsi="Verdana" w:eastAsia="Verdana" w:cs="Verdana"/>
+          <w:sz w:val="22"/>
           <w:rtl w:val="0"/>
         </w:rPr>
       </w:r>
@@ -2518,6 +2853,7 @@
         <w:tabs>
           <w:tab w:val="left" w:leader="none" w:pos="8020"/>
         </w:tabs>
+        <w:spacing w:line="276" w:lineRule="auto"/>
         <w:ind w:right="-20"/>
         <w:rPr>
           <w:rFonts w:ascii="Calibri" w:cs="Calibri" w:eastAsia="Calibri" w:hAnsi="Calibri"/>
@@ -2525,7 +2861,8 @@
       </w:pPr>
       <w:r>
         <w:rPr>
-          <w:rFonts w:ascii="Calibri" w:cs="Calibri" w:eastAsia="Calibri" w:hAnsi="Calibri"/>
+          <w:rFonts w:ascii="Verdana" w:cs="Verdana" w:eastAsia="Verdana" w:hAnsi="Verdana"/>
+          <w:sz w:val="22"/>
           <w:rtl w:val="0"/>
         </w:rPr>
         <w:t xml:space="preserve">Signature of Participant</w:t>
@@ -2542,6 +2879,8 @@
       </w:pPr>
       <w:r>
         <w:rPr>
+          <w:rFonts w:ascii="Verdana" w:hAnsi="Verdana" w:eastAsia="Verdana" w:cs="Verdana"/>
+          <w:sz w:val="22"/>
           <w:rtl w:val="0"/>
         </w:rPr>
       </w:r>
@@ -2555,7 +2894,8 @@
       </w:pPr>
       <w:r>
         <w:rPr>
-          <w:rFonts w:ascii="Calibri" w:cs="Calibri" w:eastAsia="Calibri" w:hAnsi="Calibri"/>
+          <w:rFonts w:ascii="Verdana" w:cs="Verdana" w:eastAsia="Verdana" w:hAnsi="Verdana"/>
+          <w:sz w:val="22"/>
           <w:u w:val="single"/>
           <w:rtl w:val="0"/>
         </w:rPr>
@@ -2572,6 +2912,8 @@
       </w:r>
       <w:r>
         <w:rPr>
+          <w:rFonts w:ascii="Verdana" w:hAnsi="Verdana" w:eastAsia="Verdana" w:cs="Verdana"/>
+          <w:sz w:val="22"/>
           <w:rtl w:val="0"/>
         </w:rPr>
       </w:r>
@@ -2579,6 +2921,7 @@
     <w:p>
       <w:pPr>
         <w:keepNext w:val="1"/>
+        <w:spacing w:line="276" w:lineRule="auto"/>
         <w:ind w:right="-20"/>
         <w:rPr>
           <w:rFonts w:ascii="Calibri" w:cs="Calibri" w:eastAsia="Calibri" w:hAnsi="Calibri"/>
@@ -2586,7 +2929,8 @@
       </w:pPr>
       <w:r>
         <w:rPr>
-          <w:rFonts w:ascii="Calibri" w:cs="Calibri" w:eastAsia="Calibri" w:hAnsi="Calibri"/>
+          <w:rFonts w:ascii="Verdana" w:cs="Verdana" w:eastAsia="Verdana" w:hAnsi="Verdana"/>
+          <w:sz w:val="22"/>
           <w:rtl w:val="0"/>
         </w:rPr>
         <w:t xml:space="preserve">Printed Name of Person Explaining Informed Consent Document</w:t>
@@ -2601,6 +2945,8 @@
       </w:pPr>
       <w:r>
         <w:rPr>
+          <w:rFonts w:ascii="Verdana" w:hAnsi="Verdana" w:eastAsia="Verdana" w:cs="Verdana"/>
+          <w:sz w:val="22"/>
           <w:rtl w:val="0"/>
         </w:rPr>
       </w:r>
@@ -2614,7 +2960,8 @@
       </w:pPr>
       <w:r>
         <w:rPr>
-          <w:rFonts w:ascii="Calibri" w:cs="Calibri" w:eastAsia="Calibri" w:hAnsi="Calibri"/>
+          <w:rFonts w:ascii="Verdana" w:cs="Verdana" w:eastAsia="Verdana" w:hAnsi="Verdana"/>
+          <w:sz w:val="22"/>
           <w:u w:val="single"/>
           <w:rtl w:val="0"/>
         </w:rPr>
@@ -2634,12 +2981,15 @@
       </w:r>
       <w:r>
         <w:rPr>
-          <w:rtl w:val="0"/>
-        </w:rPr>
-      </w:r>
-    </w:p>
-    <w:p>
-      <w:pPr>
+          <w:rFonts w:ascii="Verdana" w:hAnsi="Verdana" w:eastAsia="Verdana" w:cs="Verdana"/>
+          <w:sz w:val="22"/>
+          <w:rtl w:val="0"/>
+        </w:rPr>
+      </w:r>
+    </w:p>
+    <w:p>
+      <w:pPr>
+        <w:spacing w:line="276" w:lineRule="auto"/>
         <w:ind w:right="27"/>
         <w:rPr>
           <w:rFonts w:ascii="Calibri" w:cs="Calibri" w:eastAsia="Calibri" w:hAnsi="Calibri"/>
@@ -2647,7 +2997,8 @@
       </w:pPr>
       <w:r>
         <w:rPr>
-          <w:rFonts w:ascii="Calibri" w:cs="Calibri" w:eastAsia="Calibri" w:hAnsi="Calibri"/>
+          <w:rFonts w:ascii="Verdana" w:cs="Verdana" w:eastAsia="Verdana" w:hAnsi="Verdana"/>
+          <w:sz w:val="22"/>
           <w:rtl w:val="0"/>
         </w:rPr>
         <w:t xml:space="preserve">Signature of Person Explaining Informed Consent Document</w:t>
@@ -2666,12 +3017,15 @@
       </w:pPr>
       <w:r>
         <w:rPr>
-          <w:rtl w:val="0"/>
-        </w:rPr>
-      </w:r>
-    </w:p>
-    <w:p>
-      <w:pPr>
+          <w:rFonts w:ascii="Verdana" w:hAnsi="Verdana" w:eastAsia="Verdana" w:cs="Verdana"/>
+          <w:sz w:val="22"/>
+          <w:rtl w:val="0"/>
+        </w:rPr>
+      </w:r>
+    </w:p>
+    <w:p>
+      <w:pPr>
+        <w:spacing w:line="276" w:lineRule="auto"/>
         <w:ind w:right="63"/>
         <w:rPr>
           <w:rFonts w:ascii="Calibri" w:cs="Calibri" w:eastAsia="Calibri" w:hAnsi="Calibri"/>
@@ -2679,7 +3033,8 @@
       </w:pPr>
       <w:r>
         <w:rPr>
-          <w:rFonts w:ascii="Calibri" w:cs="Calibri" w:eastAsia="Calibri" w:hAnsi="Calibri"/>
+          <w:rFonts w:ascii="Verdana" w:cs="Verdana" w:eastAsia="Verdana" w:hAnsi="Verdana"/>
+          <w:sz w:val="22"/>
           <w:rtl w:val="0"/>
         </w:rPr>
         <w:t xml:space="preserve">You will be given a signed and dated copy of this informed consent document to keep.</w:t>
@@ -2689,8 +3044,12 @@
       <w:headerReference r:id="rId6" w:type="default"/>
       <w:footerReference r:id="rId7" w:type="default"/>
       <w:pgNumType w:start="1"/>
+      <w:headerReference w:type="first" r:id="rId8"/>
+      <w:footerReference w:type="first" r:id="rId9"/>
+      <w:headerReference w:type="even" r:id="rId10"/>
+      <w:footerReference w:type="even" r:id="rId11"/>
       <w:pgSz xmlns:wpc="http://schemas.microsoft.com/office/word/2010/wordprocessingCanvas" xmlns:cx="http://schemas.microsoft.com/office/drawing/2014/chartex" xmlns:cx1="http://schemas.microsoft.com/office/drawing/2015/9/8/chartex" xmlns:cx2="http://schemas.microsoft.com/office/drawing/2015/10/21/chartex" xmlns:cx3="http://schemas.microsoft.com/office/drawing/2016/5/9/chartex" xmlns:cx4="http://schemas.microsoft.com/office/drawing/2016/5/10/chartex" xmlns:cx5="http://schemas.microsoft.com/office/drawing/2016/5/11/chartex" xmlns:cx6="http://schemas.microsoft.com/office/drawing/2016/5/12/chartex" xmlns:cx7="http://schemas.microsoft.com/office/drawing/2016/5/13/chartex" xmlns:cx8="http://schemas.microsoft.com/office/drawing/2016/5/14/chartex" xmlns:aink="http://schemas.microsoft.com/office/drawing/2016/ink" xmlns:am3d="http://schemas.microsoft.com/office/drawing/2017/model3d" xmlns:oel="http://schemas.microsoft.com/office/2019/extlst" xmlns:wp14="http://schemas.microsoft.com/office/word/2010/wordprocessingDrawing" xmlns:w16du="http://schemas.microsoft.com/office/word/2023/wordml/word16du" xmlns:w16sdtdh="http://schemas.microsoft.com/office/word/2020/wordml/sdtdatahash" xmlns:w16se="http://schemas.microsoft.com/office/word/2015/wordml/symex" xmlns:wpi="http://schemas.microsoft.com/office/word/2010/wordprocessingInk" w:w="12240" w:h="15840"/>
-      <w:pgMar xmlns:wpc="http://schemas.microsoft.com/office/word/2010/wordprocessingCanvas" xmlns:cx="http://schemas.microsoft.com/office/drawing/2014/chartex" xmlns:cx1="http://schemas.microsoft.com/office/drawing/2015/9/8/chartex" xmlns:cx2="http://schemas.microsoft.com/office/drawing/2015/10/21/chartex" xmlns:cx3="http://schemas.microsoft.com/office/drawing/2016/5/9/chartex" xmlns:cx4="http://schemas.microsoft.com/office/drawing/2016/5/10/chartex" xmlns:cx5="http://schemas.microsoft.com/office/drawing/2016/5/11/chartex" xmlns:cx6="http://schemas.microsoft.com/office/drawing/2016/5/12/chartex" xmlns:cx7="http://schemas.microsoft.com/office/drawing/2016/5/13/chartex" xmlns:cx8="http://schemas.microsoft.com/office/drawing/2016/5/14/chartex" xmlns:aink="http://schemas.microsoft.com/office/drawing/2016/ink" xmlns:am3d="http://schemas.microsoft.com/office/drawing/2017/model3d" xmlns:oel="http://schemas.microsoft.com/office/2019/extlst" xmlns:wp14="http://schemas.microsoft.com/office/word/2010/wordprocessingDrawing" xmlns:w16du="http://schemas.microsoft.com/office/word/2023/wordml/word16du" xmlns:w16sdtdh="http://schemas.microsoft.com/office/word/2020/wordml/sdtdatahash" xmlns:w16se="http://schemas.microsoft.com/office/word/2015/wordml/symex" xmlns:wpi="http://schemas.microsoft.com/office/word/2010/wordprocessingInk" w:top="1440" w:right="1440" w:bottom="1440" w:left="1440" w:header="720" w:footer="720" w:gutter="0"/>
+      <w:pgMar xmlns:wpc="http://schemas.microsoft.com/office/word/2010/wordprocessingCanvas" xmlns:cx="http://schemas.microsoft.com/office/drawing/2014/chartex" xmlns:cx1="http://schemas.microsoft.com/office/drawing/2015/9/8/chartex" xmlns:cx2="http://schemas.microsoft.com/office/drawing/2015/10/21/chartex" xmlns:cx3="http://schemas.microsoft.com/office/drawing/2016/5/9/chartex" xmlns:cx4="http://schemas.microsoft.com/office/drawing/2016/5/10/chartex" xmlns:cx5="http://schemas.microsoft.com/office/drawing/2016/5/11/chartex" xmlns:cx6="http://schemas.microsoft.com/office/drawing/2016/5/12/chartex" xmlns:cx7="http://schemas.microsoft.com/office/drawing/2016/5/13/chartex" xmlns:cx8="http://schemas.microsoft.com/office/drawing/2016/5/14/chartex" xmlns:aink="http://schemas.microsoft.com/office/drawing/2016/ink" xmlns:am3d="http://schemas.microsoft.com/office/drawing/2017/model3d" xmlns:oel="http://schemas.microsoft.com/office/2019/extlst" xmlns:wp14="http://schemas.microsoft.com/office/word/2010/wordprocessingDrawing" xmlns:w16du="http://schemas.microsoft.com/office/word/2023/wordml/word16du" xmlns:w16sdtdh="http://schemas.microsoft.com/office/word/2020/wordml/sdtdatahash" xmlns:w16se="http://schemas.microsoft.com/office/word/2015/wordml/symex" xmlns:wpi="http://schemas.microsoft.com/office/word/2010/wordprocessingInk" w:top="2544" w:right="1413" w:bottom="1476" w:left="720" w:header="288" w:footer="438" w:gutter="0"/>
     </w:sectPr>
   </w:body>
 </w:document>
@@ -2712,6 +3071,8 @@
     </w:pPr>
     <w:r>
       <w:rPr>
+        <w:rFonts w:ascii="Verdana" w:hAnsi="Verdana" w:eastAsia="Verdana" w:cs="Verdana"/>
+        <w:sz w:val="22"/>
         <w:rtl w:val="0"/>
       </w:rPr>
     </w:r>
@@ -2719,198 +3080,134 @@
 </w:ftr>
 </file>
 
+<file path=word/footer2.xml><?xml version="1.0" encoding="utf-8"?>
+<w:ftr xmlns:m="http://schemas.openxmlformats.org/officeDocument/2006/math" xmlns:mc="http://schemas.openxmlformats.org/markup-compatibility/2006" xmlns:mo="http://schemas.microsoft.com/office/mac/office/2008/main" xmlns:mv="urn:schemas-microsoft-com:mac:vml" xmlns:o="urn:schemas-microsoft-com:office:office" xmlns:r="http://schemas.openxmlformats.org/officeDocument/2006/relationships" xmlns:v="urn:schemas-microsoft-com:vml" xmlns:w10="urn:schemas-microsoft-com:office:word" xmlns:w14="http://schemas.microsoft.com/office/word/2010/wordml" xmlns:w="http://schemas.openxmlformats.org/wordprocessingml/2006/main" xmlns:wne="http://schemas.microsoft.com/office/word/2006/wordml" xmlns:wp14="http://schemas.microsoft.com/office/word/2010/wordprocessingDrawing" xmlns:wp="http://schemas.openxmlformats.org/drawingml/2006/wordprocessingDrawing" xmlns:wpc="http://schemas.microsoft.com/office/word/2010/wordprocessingCanvas" xmlns:wpg="http://schemas.microsoft.com/office/word/2010/wordprocessingGroup" xmlns:wpi="http://schemas.microsoft.com/office/word/2010/wordprocessingInk" xmlns:wps="http://schemas.microsoft.com/office/word/2010/wordprocessingShape" mc:Ignorable="w14 wp14">
+  <w:p>
+    <w:pPr>
+      <w:pStyle w:val="Footer"/>
+    </w:pPr>
+  </w:p>
+</w:ftr>
+</file>
+
+<file path=word/footer3.xml><?xml version="1.0" encoding="utf-8"?>
+<w:ftr xmlns:m="http://schemas.openxmlformats.org/officeDocument/2006/math" xmlns:mc="http://schemas.openxmlformats.org/markup-compatibility/2006" xmlns:mo="http://schemas.microsoft.com/office/mac/office/2008/main" xmlns:mv="urn:schemas-microsoft-com:mac:vml" xmlns:o="urn:schemas-microsoft-com:office:office" xmlns:r="http://schemas.openxmlformats.org/officeDocument/2006/relationships" xmlns:v="urn:schemas-microsoft-com:vml" xmlns:w10="urn:schemas-microsoft-com:office:word" xmlns:w14="http://schemas.microsoft.com/office/word/2010/wordml" xmlns:w="http://schemas.openxmlformats.org/wordprocessingml/2006/main" xmlns:wne="http://schemas.microsoft.com/office/word/2006/wordml" xmlns:wp14="http://schemas.microsoft.com/office/word/2010/wordprocessingDrawing" xmlns:wp="http://schemas.openxmlformats.org/drawingml/2006/wordprocessingDrawing" xmlns:wpc="http://schemas.microsoft.com/office/word/2010/wordprocessingCanvas" xmlns:wpg="http://schemas.microsoft.com/office/word/2010/wordprocessingGroup" xmlns:wpi="http://schemas.microsoft.com/office/word/2010/wordprocessingInk" xmlns:wps="http://schemas.microsoft.com/office/word/2010/wordprocessingShape" mc:Ignorable="w14 wp14">
+  <w:p>
+    <w:pPr>
+      <w:pStyle w:val="Footer"/>
+    </w:pPr>
+  </w:p>
+</w:ftr>
+</file>
+
 <file path=word/header1.xml><?xml version="1.0" encoding="utf-8"?>
 <w:hdr xmlns:mc="http://schemas.openxmlformats.org/markup-compatibility/2006" xmlns:o="urn:schemas-microsoft-com:office:office" xmlns:r="http://schemas.openxmlformats.org/officeDocument/2006/relationships" xmlns:m="http://schemas.openxmlformats.org/officeDocument/2006/math" xmlns:v="urn:schemas-microsoft-com:vml" xmlns:wp="http://schemas.openxmlformats.org/drawingml/2006/wordprocessingDrawing" xmlns:w10="urn:schemas-microsoft-com:office:word" xmlns:w="http://schemas.openxmlformats.org/wordprocessingml/2006/main" xmlns:wne="http://schemas.microsoft.com/office/word/2006/wordml" xmlns:sl="http://schemas.openxmlformats.org/schemaLibrary/2006/main" xmlns:a="http://schemas.openxmlformats.org/drawingml/2006/main" xmlns:pic="http://schemas.openxmlformats.org/drawingml/2006/picture" xmlns:c="http://schemas.openxmlformats.org/drawingml/2006/chart" xmlns:lc="http://schemas.openxmlformats.org/drawingml/2006/lockedCanvas" xmlns:dgm="http://schemas.openxmlformats.org/drawingml/2006/diagram" xmlns:wps="http://schemas.microsoft.com/office/word/2010/wordprocessingShape" xmlns:wpg="http://schemas.microsoft.com/office/word/2010/wordprocessingGroup" xmlns:w14="http://schemas.microsoft.com/office/word/2010/wordml" xmlns:w15="http://schemas.microsoft.com/office/word/2012/wordml" xmlns:w16="http://schemas.microsoft.com/office/word/2018/wordml" xmlns:w16cex="http://schemas.microsoft.com/office/word/2018/wordml/cex" xmlns:w16cid="http://schemas.microsoft.com/office/word/2016/wordml/cid" xmlns="http://schemas.microsoft.com/office/tasks/2019/documenttasks" xmlns:cr="http://schemas.microsoft.com/office/comments/2020/reactions">
-  <w:p>
-    <w:pPr>
-      <w:widowControl w:val="0"/>
-      <w:spacing w:line="276" w:lineRule="auto"/>
-      <w:rPr>
-        <w:rFonts w:ascii="Calibri" w:cs="Calibri" w:eastAsia="Calibri" w:hAnsi="Calibri"/>
-      </w:rPr>
-    </w:pPr>
-    <w:r>
-      <w:rPr>
-        <w:rtl w:val="0"/>
-      </w:rPr>
-    </w:r>
-  </w:p>
   <w:tbl>
     <w:tblPr>
-      <w:tblStyle w:val="Table2"/>
-      <w:tblW w:w="9360.0" w:type="dxa"/>
-      <w:jc w:val="left"/>
-      <w:tblLayout w:type="fixed"/>
-      <w:tblLook w:val="0000"/>
+      <w:tblW w:type="auto" w:w="0"/>
+      <w:jc w:val="center"/>
+      <w:tblLook w:firstColumn="1" w:firstRow="1" w:lastColumn="0" w:lastRow="0" w:noHBand="0" w:noVBand="1" w:val="04A0"/>
+      <w:tblBorders>
+        <w:top w:val="nil"/>
+        <w:left w:val="nil"/>
+        <w:bottom w:val="nil"/>
+        <w:right w:val="nil"/>
+        <w:insideH w:val="nil"/>
+        <w:insideV w:val="nil"/>
+      </w:tblBorders>
     </w:tblPr>
     <w:tblGrid>
-      <w:gridCol w:w="7475"/>
-      <w:gridCol w:w="1885"/>
-      <w:tblGridChange w:id="0">
-        <w:tblGrid>
-          <w:gridCol w:w="7475"/>
-          <w:gridCol w:w="1885"/>
-        </w:tblGrid>
-      </w:tblGridChange>
+      <w:gridCol w:w="8280"/>
+      <w:gridCol w:w="2160"/>
     </w:tblGrid>
     <w:tr>
-      <w:trPr>
-        <w:cantSplit w:val="0"/>
-        <w:tblHeader w:val="0"/>
-      </w:trPr>
       <w:tc>
         <w:tcPr>
-          <w:vAlign w:val="center"/>
+          <w:tcW w:type="dxa" w:w="5220"/>
         </w:tcPr>
         <w:p>
           <w:pPr>
-            <w:tabs>
-              <w:tab w:val="center" w:leader="none" w:pos="4680"/>
-              <w:tab w:val="right" w:leader="none" w:pos="9360"/>
-            </w:tabs>
-            <w:rPr>
-              <w:rFonts w:ascii="Calibri" w:cs="Calibri" w:eastAsia="Calibri" w:hAnsi="Calibri"/>
-              <w:i w:val="1"/>
-              <w:iCs w:val="1"/>
-              <w:sz w:val="17"/>
-              <w:szCs w:val="17"/>
-            </w:rPr>
+            <w:spacing w:after="0" w:line="276" w:lineRule="auto"/>
           </w:pPr>
           <w:r>
             <w:rPr>
-              <w:i w:val="1"/>
-              <w:iCs w:val="1"/>
-              <w:sz w:val="17"/>
-              <w:szCs w:val="17"/>
-              <w:rtl w:val="0"/>
+              <w:rFonts w:ascii="Verdana" w:hAnsi="Verdana" w:eastAsia="Verdana" w:cs="Verdana"/>
+              <w:sz w:val="16"/>
             </w:rPr>
-            <w:t xml:space="preserve">{principalInvestigatorName} / Protocol Number {protocolNumber}</w:t>
-          </w:r>
-          <w:r>
-            <w:rPr>
-              <w:rtl w:val="0"/>
-            </w:rPr>
+            <w:t>{protocolNumber}</w:t>
+            <w:br/>
+            <w:t>Informed Consent</w:t>
           </w:r>
         </w:p>
       </w:tc>
       <w:tc>
         <w:tcPr>
-          <w:vAlign w:val="center"/>
+          <w:tcW w:type="dxa" w:w="5220"/>
         </w:tcPr>
         <w:p>
           <w:pPr>
-            <w:tabs>
-              <w:tab w:val="center" w:leader="none" w:pos="4680"/>
-              <w:tab w:val="right" w:leader="none" w:pos="9360"/>
-            </w:tabs>
+            <w:spacing w:after="0" w:line="276" w:lineRule="auto"/>
             <w:jc w:val="right"/>
-            <w:rPr>
-              <w:rFonts w:ascii="Calibri" w:cs="Calibri" w:eastAsia="Calibri" w:hAnsi="Calibri"/>
-              <w:i w:val="1"/>
-              <w:iCs w:val="1"/>
-              <w:sz w:val="17"/>
-              <w:szCs w:val="17"/>
-            </w:rPr>
           </w:pPr>
           <w:r>
             <w:rPr>
-              <w:i w:val="1"/>
-              <w:iCs w:val="1"/>
-              <w:sz w:val="17"/>
-              <w:szCs w:val="17"/>
-              <w:rtl w:val="0"/>
+              <w:rFonts w:ascii="Verdana" w:hAnsi="Verdana" w:eastAsia="Verdana" w:cs="Verdana"/>
+              <w:sz w:val="16"/>
             </w:rPr>
             <w:t xml:space="preserve">Page </w:t>
           </w:r>
           <w:r>
             <w:rPr>
-              <w:i w:val="1"/>
-              <w:iCs w:val="1"/>
-              <w:sz w:val="17"/>
-              <w:szCs w:val="17"/>
+              <w:rFonts w:ascii="Verdana" w:hAnsi="Verdana" w:eastAsia="Verdana" w:cs="Verdana"/>
+              <w:sz w:val="16"/>
             </w:rPr>
             <w:fldChar w:fldCharType="begin"/>
-            <w:instrText xml:space="preserve">PAGE</w:instrText>
+            <w:instrText xml:space="preserve"> PAGE </w:instrText>
             <w:fldChar w:fldCharType="separate"/>
+            <w:t>1</w:t>
             <w:fldChar w:fldCharType="end"/>
           </w:r>
           <w:r>
             <w:rPr>
-              <w:i w:val="1"/>
-              <w:iCs w:val="1"/>
-              <w:sz w:val="17"/>
-              <w:szCs w:val="17"/>
-              <w:rtl w:val="0"/>
+              <w:rFonts w:ascii="Verdana" w:hAnsi="Verdana" w:eastAsia="Verdana" w:cs="Verdana"/>
+              <w:sz w:val="16"/>
             </w:rPr>
             <w:t xml:space="preserve"> of </w:t>
           </w:r>
           <w:r>
             <w:rPr>
-              <w:i w:val="1"/>
-              <w:iCs w:val="1"/>
-              <w:sz w:val="17"/>
-              <w:szCs w:val="17"/>
+              <w:rFonts w:ascii="Verdana" w:hAnsi="Verdana" w:eastAsia="Verdana" w:cs="Verdana"/>
+              <w:sz w:val="16"/>
             </w:rPr>
             <w:fldChar w:fldCharType="begin"/>
-            <w:instrText xml:space="preserve">NUMPAGES</w:instrText>
+            <w:instrText xml:space="preserve"> NUMPAGES </w:instrText>
             <w:fldChar w:fldCharType="separate"/>
+            <w:t>1</w:t>
             <w:fldChar w:fldCharType="end"/>
-          </w:r>
-          <w:r>
-            <w:rPr>
-              <w:i w:val="1"/>
-              <w:iCs w:val="1"/>
-              <w:sz w:val="17"/>
-              <w:szCs w:val="17"/>
-              <w:rtl w:val="0"/>
-            </w:rPr>
-            <w:t xml:space="preserve">  </w:t>
-          </w:r>
-          <w:r>
-            <w:rPr>
-              <w:rtl w:val="0"/>
-            </w:rPr>
           </w:r>
         </w:p>
       </w:tc>
     </w:tr>
   </w:tbl>
+</w:hdr>
+</file>
+
+<file path=word/header2.xml><?xml version="1.0" encoding="utf-8"?>
+<w:hdr xmlns:m="http://schemas.openxmlformats.org/officeDocument/2006/math" xmlns:mc="http://schemas.openxmlformats.org/markup-compatibility/2006" xmlns:mo="http://schemas.microsoft.com/office/mac/office/2008/main" xmlns:mv="urn:schemas-microsoft-com:mac:vml" xmlns:o="urn:schemas-microsoft-com:office:office" xmlns:r="http://schemas.openxmlformats.org/officeDocument/2006/relationships" xmlns:v="urn:schemas-microsoft-com:vml" xmlns:w10="urn:schemas-microsoft-com:office:word" xmlns:w14="http://schemas.microsoft.com/office/word/2010/wordml" xmlns:w="http://schemas.openxmlformats.org/wordprocessingml/2006/main" xmlns:wne="http://schemas.microsoft.com/office/word/2006/wordml" xmlns:wp14="http://schemas.microsoft.com/office/word/2010/wordprocessingDrawing" xmlns:wp="http://schemas.openxmlformats.org/drawingml/2006/wordprocessingDrawing" xmlns:wpc="http://schemas.microsoft.com/office/word/2010/wordprocessingCanvas" xmlns:wpg="http://schemas.microsoft.com/office/word/2010/wordprocessingGroup" xmlns:wpi="http://schemas.microsoft.com/office/word/2010/wordprocessingInk" xmlns:wps="http://schemas.microsoft.com/office/word/2010/wordprocessingShape" mc:Ignorable="w14 wp14">
   <w:p>
     <w:pPr>
-      <w:tabs>
-        <w:tab w:val="center" w:leader="none" w:pos="4680"/>
-        <w:tab w:val="right" w:leader="none" w:pos="9360"/>
-      </w:tabs>
-      <w:rPr>
-        <w:b w:val="1"/>
-        <w:bCs w:val="1"/>
-        <w:sz w:val="18"/>
-        <w:szCs w:val="18"/>
-      </w:rPr>
+      <w:pStyle w:val="Header"/>
     </w:pPr>
-    <w:r>
-      <w:rPr>
-        <w:rtl w:val="0"/>
-      </w:rPr>
-    </w:r>
   </w:p>
+</w:hdr>
+</file>
+
+<file path=word/header3.xml><?xml version="1.0" encoding="utf-8"?>
+<w:hdr xmlns:m="http://schemas.openxmlformats.org/officeDocument/2006/math" xmlns:mc="http://schemas.openxmlformats.org/markup-compatibility/2006" xmlns:mo="http://schemas.microsoft.com/office/mac/office/2008/main" xmlns:mv="urn:schemas-microsoft-com:mac:vml" xmlns:o="urn:schemas-microsoft-com:office:office" xmlns:r="http://schemas.openxmlformats.org/officeDocument/2006/relationships" xmlns:v="urn:schemas-microsoft-com:vml" xmlns:w10="urn:schemas-microsoft-com:office:word" xmlns:w14="http://schemas.microsoft.com/office/word/2010/wordml" xmlns:w="http://schemas.openxmlformats.org/wordprocessingml/2006/main" xmlns:wne="http://schemas.microsoft.com/office/word/2006/wordml" xmlns:wp14="http://schemas.microsoft.com/office/word/2010/wordprocessingDrawing" xmlns:wp="http://schemas.openxmlformats.org/drawingml/2006/wordprocessingDrawing" xmlns:wpc="http://schemas.microsoft.com/office/word/2010/wordprocessingCanvas" xmlns:wpg="http://schemas.microsoft.com/office/word/2010/wordprocessingGroup" xmlns:wpi="http://schemas.microsoft.com/office/word/2010/wordprocessingInk" xmlns:wps="http://schemas.microsoft.com/office/word/2010/wordprocessingShape" mc:Ignorable="w14 wp14">
   <w:p>
     <w:pPr>
-      <w:tabs>
-        <w:tab w:val="center" w:leader="none" w:pos="4680"/>
-        <w:tab w:val="right" w:leader="none" w:pos="9360"/>
-      </w:tabs>
-      <w:rPr>
-        <w:rFonts w:ascii="Calibri" w:cs="Calibri" w:eastAsia="Calibri" w:hAnsi="Calibri"/>
-        <w:sz w:val="22"/>
-        <w:szCs w:val="22"/>
-      </w:rPr>
+      <w:pStyle w:val="Header"/>
     </w:pPr>
-    <w:r>
-      <w:rPr>
-        <w:rtl w:val="0"/>
-      </w:rPr>
-    </w:r>
   </w:p>
 </w:hdr>
 </file>
@@ -3881,11 +4178,11 @@
     <w:qFormat/>
     <w:rsid w:val="00817704"/>
     <w:pPr>
-      <w:spacing w:after="0" w:line="240" w:lineRule="auto"/>
+      <w:spacing w:after="200" w:line="276" w:lineRule="auto"/>
     </w:pPr>
     <w:rPr>
-      <w:rFonts w:ascii="Times New Roman" w:eastAsia="Times New Roman" w:hAnsi="Times New Roman" w:cs="Times New Roman"/>
-      <w:sz w:val="24"/>
+      <w:rFonts w:ascii="Verdana" w:eastAsia="Times New Roman" w:hAnsi="Verdana" w:cs="Times New Roman"/>
+      <w:sz w:val="22"/>
       <w:szCs w:val="24"/>
     </w:rPr>
   </w:style>

</xml_diff>